<commit_message>
L-0703: docs, CHANGELOG and crew 1.1.5 for the promote-gate sha and review rules
promote.md, README, CONFIG.md, crew-verification and crew-setup skills,
PLUGINS.md, INSTALLATION.md and the guide sources (rebuilt HTML/DOCX/PDF)
state the full-sha row, the review-evidence requirement and its
requireReview:false + reviewReason opt-out, what the evidence does not
prove, and the no-python behaviour. CHANGELOG entry marked BREAKING;
crew 1.1.4 -> 1.1.5 in plugin.json, marketplace.json and PLUGINS.md;
promote.md allowance 380 -> 392; BUDGETS count re-measured; TODO
follow-ups.
</commit_message>
<xml_diff>
--- a/docs/guides/crew/crew-guide.docx
+++ b/docs/guides/crew/crew-guide.docx
@@ -1,6 +1,6 @@
 
 <file path=word/document.xml><?xml version="1.0" encoding="utf-8"?>
-<w:document xmlns:o="urn:schemas-microsoft-com:office:office" xmlns:r="http://schemas.openxmlformats.org/officeDocument/2006/relationships" xmlns:v="urn:schemas-microsoft-com:vml" xmlns:w="http://schemas.openxmlformats.org/wordprocessingml/2006/main" xmlns:w10="urn:schemas-microsoft-com:office:word" xmlns:wp="http://schemas.openxmlformats.org/drawingml/2006/wordprocessingDrawing" xmlns:wps="http://schemas.microsoft.com/office/word/2010/wordprocessingShape" xmlns:wpg="http://schemas.microsoft.com/office/word/2010/wordprocessingGroup" xmlns:mc="http://schemas.openxmlformats.org/markup-compatibility/2006" xmlns:wp14="http://schemas.microsoft.com/office/word/2010/wordprocessingDrawing" xmlns:w14="http://schemas.microsoft.com/office/word/2010/wordml" xmlns:w15="http://schemas.microsoft.com/office/word/2012/wordml" mc:Ignorable="w14 wp14 w15">
+<w:document xmlns:o="urn:schemas-microsoft-com:office:office" xmlns:r="http://schemas.openxmlformats.org/officeDocument/2006/relationships" xmlns:v="urn:schemas-microsoft-com:vml" xmlns:w="http://schemas.openxmlformats.org/wordprocessingml/2006/main" xmlns:w10="urn:schemas-microsoft-com:office:word" xmlns:wp="http://schemas.openxmlformats.org/drawingml/2006/wordprocessingDrawing" xmlns:pic="http://schemas.openxmlformats.org/drawingml/2006/picture" xmlns:wps="http://schemas.microsoft.com/office/word/2010/wordprocessingShape" xmlns:wpg="http://schemas.microsoft.com/office/word/2010/wordprocessingGroup" xmlns:mc="http://schemas.openxmlformats.org/markup-compatibility/2006" xmlns:wp14="http://schemas.microsoft.com/office/word/2010/wordprocessingDrawing" xmlns:w14="http://schemas.microsoft.com/office/word/2010/wordml" xmlns:w15="http://schemas.microsoft.com/office/word/2012/wordml" mc:Ignorable="w14 wp14 w15">
   <w:body>
     <w:p>
       <w:pPr>
@@ -129,9 +129,9 @@
     </w:p>
     <w:tbl>
       <w:tblPr>
-        <w:tblW w:w="3888" w:type="dxa"/>
-        <w:jc w:val="left"/>
-        <w:tblInd w:w="0" w:type="dxa"/>
+        <w:tblW w:w="11339" w:type="dxa"/>
+        <w:jc w:val="left"/>
+        <w:tblInd w:w="28" w:type="dxa"/>
         <w:tblLayout w:type="fixed"/>
         <w:tblCellMar>
           <w:top w:w="28" w:type="dxa"/>
@@ -141,9 +141,9 @@
         </w:tblCellMar>
       </w:tblPr>
       <w:tblGrid>
-        <w:gridCol w:w="1411"/>
-        <w:gridCol w:w="1351"/>
-        <w:gridCol w:w="1126"/>
+        <w:gridCol w:w="1414"/>
+        <w:gridCol w:w="7248"/>
+        <w:gridCol w:w="2677"/>
       </w:tblGrid>
       <w:tr>
         <w:trPr>
@@ -151,7 +151,7 @@
         </w:trPr>
         <w:tc>
           <w:tcPr>
-            <w:tcW w:w="1411" w:type="dxa"/>
+            <w:tcW w:w="1414" w:type="dxa"/>
             <w:tcBorders/>
             <w:vAlign w:val="center"/>
           </w:tcPr>
@@ -173,7 +173,7 @@
         </w:tc>
         <w:tc>
           <w:tcPr>
-            <w:tcW w:w="1351" w:type="dxa"/>
+            <w:tcW w:w="7248" w:type="dxa"/>
             <w:tcBorders/>
             <w:vAlign w:val="center"/>
           </w:tcPr>
@@ -195,7 +195,7 @@
         </w:tc>
         <w:tc>
           <w:tcPr>
-            <w:tcW w:w="1126" w:type="dxa"/>
+            <w:tcW w:w="2677" w:type="dxa"/>
             <w:tcBorders/>
             <w:vAlign w:val="center"/>
           </w:tcPr>
@@ -220,7 +220,7 @@
         <w:trPr/>
         <w:tc>
           <w:tcPr>
-            <w:tcW w:w="1411" w:type="dxa"/>
+            <w:tcW w:w="1414" w:type="dxa"/>
             <w:tcBorders/>
             <w:vAlign w:val="center"/>
           </w:tcPr>
@@ -243,7 +243,7 @@
         </w:tc>
         <w:tc>
           <w:tcPr>
-            <w:tcW w:w="1351" w:type="dxa"/>
+            <w:tcW w:w="7248" w:type="dxa"/>
             <w:tcBorders/>
             <w:vAlign w:val="center"/>
           </w:tcPr>
@@ -264,7 +264,7 @@
         </w:tc>
         <w:tc>
           <w:tcPr>
-            <w:tcW w:w="1126" w:type="dxa"/>
+            <w:tcW w:w="2677" w:type="dxa"/>
             <w:tcBorders/>
             <w:vAlign w:val="center"/>
           </w:tcPr>
@@ -288,7 +288,7 @@
         <w:trPr/>
         <w:tc>
           <w:tcPr>
-            <w:tcW w:w="1411" w:type="dxa"/>
+            <w:tcW w:w="1414" w:type="dxa"/>
             <w:tcBorders/>
             <w:vAlign w:val="center"/>
           </w:tcPr>
@@ -311,7 +311,7 @@
         </w:tc>
         <w:tc>
           <w:tcPr>
-            <w:tcW w:w="1351" w:type="dxa"/>
+            <w:tcW w:w="7248" w:type="dxa"/>
             <w:tcBorders/>
             <w:vAlign w:val="center"/>
           </w:tcPr>
@@ -332,7 +332,7 @@
         </w:tc>
         <w:tc>
           <w:tcPr>
-            <w:tcW w:w="1126" w:type="dxa"/>
+            <w:tcW w:w="2677" w:type="dxa"/>
             <w:tcBorders/>
             <w:vAlign w:val="center"/>
           </w:tcPr>
@@ -356,7 +356,7 @@
         <w:trPr/>
         <w:tc>
           <w:tcPr>
-            <w:tcW w:w="1411" w:type="dxa"/>
+            <w:tcW w:w="1414" w:type="dxa"/>
             <w:tcBorders/>
             <w:vAlign w:val="center"/>
           </w:tcPr>
@@ -379,7 +379,7 @@
         </w:tc>
         <w:tc>
           <w:tcPr>
-            <w:tcW w:w="1351" w:type="dxa"/>
+            <w:tcW w:w="7248" w:type="dxa"/>
             <w:tcBorders/>
             <w:vAlign w:val="center"/>
           </w:tcPr>
@@ -400,7 +400,7 @@
         </w:tc>
         <w:tc>
           <w:tcPr>
-            <w:tcW w:w="1126" w:type="dxa"/>
+            <w:tcW w:w="2677" w:type="dxa"/>
             <w:tcBorders/>
             <w:vAlign w:val="center"/>
           </w:tcPr>
@@ -424,7 +424,7 @@
         <w:trPr/>
         <w:tc>
           <w:tcPr>
-            <w:tcW w:w="1411" w:type="dxa"/>
+            <w:tcW w:w="1414" w:type="dxa"/>
             <w:tcBorders/>
             <w:vAlign w:val="center"/>
           </w:tcPr>
@@ -447,7 +447,7 @@
         </w:tc>
         <w:tc>
           <w:tcPr>
-            <w:tcW w:w="1351" w:type="dxa"/>
+            <w:tcW w:w="7248" w:type="dxa"/>
             <w:tcBorders/>
             <w:vAlign w:val="center"/>
           </w:tcPr>
@@ -468,7 +468,7 @@
         </w:tc>
         <w:tc>
           <w:tcPr>
-            <w:tcW w:w="1126" w:type="dxa"/>
+            <w:tcW w:w="2677" w:type="dxa"/>
             <w:tcBorders/>
             <w:vAlign w:val="center"/>
           </w:tcPr>
@@ -2674,7 +2674,7 @@
       </w:r>
       <w:r>
         <w:rPr/>
-        <w:t xml:space="preserve">. Before the deploy it checks that the upstream environment passed for this exact sha, that a rollback is declared, that a person approved it when </w:t>
+        <w:t xml:space="preserve">. Before the deploy it checks that the upstream environment passed for this exact sha (a promotion row carries the full sha), that a rollback is declared, that a person approved it when </w:t>
       </w:r>
       <w:r>
         <w:rPr>
@@ -2684,7 +2684,17 @@
       </w:r>
       <w:r>
         <w:rPr/>
-        <w:t xml:space="preserve"> is set, and that the tree is clean.</w:t>
+        <w:t xml:space="preserve"> is set, that an accepted review covers the exact tree being deployed (unless the environment opts out with </w:t>
+      </w:r>
+      <w:r>
+        <w:rPr>
+          <w:rStyle w:val="SourceText"/>
+        </w:rPr>
+        <w:t>requireReview: false</w:t>
+      </w:r>
+      <w:r>
+        <w:rPr/>
+        <w:t xml:space="preserve"> and a reason), and that the tree is clean.</w:t>
       </w:r>
     </w:p>
     <w:p>
@@ -4504,9 +4514,9 @@
     </w:p>
     <w:tbl>
       <w:tblPr>
-        <w:tblW w:w="3888" w:type="dxa"/>
-        <w:jc w:val="left"/>
-        <w:tblInd w:w="0" w:type="dxa"/>
+        <w:tblW w:w="10160" w:type="dxa"/>
+        <w:jc w:val="left"/>
+        <w:tblInd w:w="28" w:type="dxa"/>
         <w:tblLayout w:type="fixed"/>
         <w:tblCellMar>
           <w:top w:w="28" w:type="dxa"/>
@@ -4516,8 +4526,8 @@
         </w:tblCellMar>
       </w:tblPr>
       <w:tblGrid>
-        <w:gridCol w:w="1007"/>
-        <w:gridCol w:w="2881"/>
+        <w:gridCol w:w="952"/>
+        <w:gridCol w:w="9208"/>
       </w:tblGrid>
       <w:tr>
         <w:trPr>
@@ -4525,7 +4535,7 @@
         </w:trPr>
         <w:tc>
           <w:tcPr>
-            <w:tcW w:w="1007" w:type="dxa"/>
+            <w:tcW w:w="952" w:type="dxa"/>
             <w:tcBorders/>
             <w:vAlign w:val="center"/>
           </w:tcPr>
@@ -4547,7 +4557,7 @@
         </w:tc>
         <w:tc>
           <w:tcPr>
-            <w:tcW w:w="2881" w:type="dxa"/>
+            <w:tcW w:w="9208" w:type="dxa"/>
             <w:tcBorders/>
             <w:vAlign w:val="center"/>
           </w:tcPr>
@@ -4572,7 +4582,7 @@
         <w:trPr/>
         <w:tc>
           <w:tcPr>
-            <w:tcW w:w="1007" w:type="dxa"/>
+            <w:tcW w:w="952" w:type="dxa"/>
             <w:tcBorders/>
             <w:vAlign w:val="center"/>
           </w:tcPr>
@@ -4593,7 +4603,7 @@
         </w:tc>
         <w:tc>
           <w:tcPr>
-            <w:tcW w:w="2881" w:type="dxa"/>
+            <w:tcW w:w="9208" w:type="dxa"/>
             <w:tcBorders/>
             <w:vAlign w:val="center"/>
           </w:tcPr>
@@ -4617,7 +4627,7 @@
         <w:trPr/>
         <w:tc>
           <w:tcPr>
-            <w:tcW w:w="1007" w:type="dxa"/>
+            <w:tcW w:w="952" w:type="dxa"/>
             <w:tcBorders/>
             <w:vAlign w:val="center"/>
           </w:tcPr>
@@ -4638,7 +4648,7 @@
         </w:tc>
         <w:tc>
           <w:tcPr>
-            <w:tcW w:w="2881" w:type="dxa"/>
+            <w:tcW w:w="9208" w:type="dxa"/>
             <w:tcBorders/>
             <w:vAlign w:val="center"/>
           </w:tcPr>
@@ -4662,7 +4672,7 @@
         <w:trPr/>
         <w:tc>
           <w:tcPr>
-            <w:tcW w:w="1007" w:type="dxa"/>
+            <w:tcW w:w="952" w:type="dxa"/>
             <w:tcBorders/>
             <w:vAlign w:val="center"/>
           </w:tcPr>
@@ -4683,7 +4693,7 @@
         </w:tc>
         <w:tc>
           <w:tcPr>
-            <w:tcW w:w="2881" w:type="dxa"/>
+            <w:tcW w:w="9208" w:type="dxa"/>
             <w:tcBorders/>
             <w:vAlign w:val="center"/>
           </w:tcPr>
@@ -4709,7 +4719,7 @@
         <w:trPr/>
         <w:tc>
           <w:tcPr>
-            <w:tcW w:w="1007" w:type="dxa"/>
+            <w:tcW w:w="952" w:type="dxa"/>
             <w:tcBorders/>
             <w:vAlign w:val="center"/>
           </w:tcPr>
@@ -4730,7 +4740,7 @@
         </w:tc>
         <w:tc>
           <w:tcPr>
-            <w:tcW w:w="2881" w:type="dxa"/>
+            <w:tcW w:w="9208" w:type="dxa"/>
             <w:tcBorders/>
             <w:vAlign w:val="center"/>
           </w:tcPr>
@@ -4754,7 +4764,7 @@
         <w:trPr/>
         <w:tc>
           <w:tcPr>
-            <w:tcW w:w="1007" w:type="dxa"/>
+            <w:tcW w:w="952" w:type="dxa"/>
             <w:tcBorders/>
             <w:vAlign w:val="center"/>
           </w:tcPr>
@@ -4775,7 +4785,7 @@
         </w:tc>
         <w:tc>
           <w:tcPr>
-            <w:tcW w:w="2881" w:type="dxa"/>
+            <w:tcW w:w="9208" w:type="dxa"/>
             <w:tcBorders/>
             <w:vAlign w:val="center"/>
           </w:tcPr>
@@ -4799,7 +4809,7 @@
         <w:trPr/>
         <w:tc>
           <w:tcPr>
-            <w:tcW w:w="1007" w:type="dxa"/>
+            <w:tcW w:w="952" w:type="dxa"/>
             <w:tcBorders/>
             <w:vAlign w:val="center"/>
           </w:tcPr>
@@ -4820,7 +4830,7 @@
         </w:tc>
         <w:tc>
           <w:tcPr>
-            <w:tcW w:w="2881" w:type="dxa"/>
+            <w:tcW w:w="9208" w:type="dxa"/>
             <w:tcBorders/>
             <w:vAlign w:val="center"/>
           </w:tcPr>
@@ -4844,7 +4854,7 @@
         <w:trPr/>
         <w:tc>
           <w:tcPr>
-            <w:tcW w:w="1007" w:type="dxa"/>
+            <w:tcW w:w="952" w:type="dxa"/>
             <w:tcBorders/>
             <w:vAlign w:val="center"/>
           </w:tcPr>
@@ -4865,7 +4875,7 @@
         </w:tc>
         <w:tc>
           <w:tcPr>
-            <w:tcW w:w="2881" w:type="dxa"/>
+            <w:tcW w:w="9208" w:type="dxa"/>
             <w:tcBorders/>
             <w:vAlign w:val="center"/>
           </w:tcPr>
@@ -4899,7 +4909,7 @@
         <w:trPr/>
         <w:tc>
           <w:tcPr>
-            <w:tcW w:w="1007" w:type="dxa"/>
+            <w:tcW w:w="952" w:type="dxa"/>
             <w:tcBorders/>
             <w:vAlign w:val="center"/>
           </w:tcPr>
@@ -4920,7 +4930,7 @@
         </w:tc>
         <w:tc>
           <w:tcPr>
-            <w:tcW w:w="2881" w:type="dxa"/>
+            <w:tcW w:w="9208" w:type="dxa"/>
             <w:tcBorders/>
             <w:vAlign w:val="center"/>
           </w:tcPr>
@@ -4944,7 +4954,7 @@
         <w:trPr/>
         <w:tc>
           <w:tcPr>
-            <w:tcW w:w="1007" w:type="dxa"/>
+            <w:tcW w:w="952" w:type="dxa"/>
             <w:tcBorders/>
             <w:vAlign w:val="center"/>
           </w:tcPr>
@@ -4965,7 +4975,7 @@
         </w:tc>
         <w:tc>
           <w:tcPr>
-            <w:tcW w:w="2881" w:type="dxa"/>
+            <w:tcW w:w="9208" w:type="dxa"/>
             <w:tcBorders/>
             <w:vAlign w:val="center"/>
           </w:tcPr>
@@ -4989,7 +4999,7 @@
         <w:trPr/>
         <w:tc>
           <w:tcPr>
-            <w:tcW w:w="1007" w:type="dxa"/>
+            <w:tcW w:w="952" w:type="dxa"/>
             <w:tcBorders/>
             <w:vAlign w:val="center"/>
           </w:tcPr>
@@ -5010,7 +5020,7 @@
         </w:tc>
         <w:tc>
           <w:tcPr>
-            <w:tcW w:w="2881" w:type="dxa"/>
+            <w:tcW w:w="9208" w:type="dxa"/>
             <w:tcBorders/>
             <w:vAlign w:val="center"/>
           </w:tcPr>
@@ -6360,7 +6370,7 @@
       <w:start w:val="1"/>
       <w:numFmt w:val="none"/>
       <w:suff w:val="nothing"/>
-      <w:lvlText w:val="%1"/>
+      <w:lvlText w:val=""/>
       <w:lvlJc w:val="left"/>
       <w:pPr>
         <w:tabs>
@@ -6371,10 +6381,37 @@
     </w:lvl>
     <w:lvl w:ilvl="1">
       <w:start w:val="1"/>
+      <w:numFmt w:val="none"/>
       <w:pStyle w:val="Heading2"/>
+      <w:suff w:val="nothing"/>
+      <w:lvlText w:val=""/>
+      <w:lvlJc w:val="left"/>
+      <w:pPr>
+        <w:tabs>
+          <w:tab w:val="num" w:pos="0"/>
+        </w:tabs>
+        <w:ind w:left="0" w:hanging="0"/>
+      </w:pPr>
+    </w:lvl>
+    <w:lvl w:ilvl="2">
+      <w:start w:val="1"/>
+      <w:numFmt w:val="none"/>
+      <w:pStyle w:val="Heading3"/>
+      <w:suff w:val="nothing"/>
+      <w:lvlText w:val=""/>
+      <w:lvlJc w:val="left"/>
+      <w:pPr>
+        <w:tabs>
+          <w:tab w:val="num" w:pos="0"/>
+        </w:tabs>
+        <w:ind w:left="0" w:hanging="0"/>
+      </w:pPr>
+    </w:lvl>
+    <w:lvl w:ilvl="3">
+      <w:start w:val="1"/>
       <w:numFmt w:val="none"/>
       <w:suff w:val="nothing"/>
-      <w:lvlText w:val="%2"/>
+      <w:lvlText w:val=""/>
       <w:lvlJc w:val="left"/>
       <w:pPr>
         <w:tabs>
@@ -6383,12 +6420,11 @@
         <w:ind w:left="0" w:hanging="0"/>
       </w:pPr>
     </w:lvl>
-    <w:lvl w:ilvl="2">
-      <w:start w:val="1"/>
-      <w:pStyle w:val="Heading3"/>
+    <w:lvl w:ilvl="4">
+      <w:start w:val="1"/>
       <w:numFmt w:val="none"/>
       <w:suff w:val="nothing"/>
-      <w:lvlText w:val="%3"/>
+      <w:lvlText w:val=""/>
       <w:lvlJc w:val="left"/>
       <w:pPr>
         <w:tabs>
@@ -6397,11 +6433,11 @@
         <w:ind w:left="0" w:hanging="0"/>
       </w:pPr>
     </w:lvl>
-    <w:lvl w:ilvl="3">
+    <w:lvl w:ilvl="5">
       <w:start w:val="1"/>
       <w:numFmt w:val="none"/>
       <w:suff w:val="nothing"/>
-      <w:lvlText w:val="%4"/>
+      <w:lvlText w:val=""/>
       <w:lvlJc w:val="left"/>
       <w:pPr>
         <w:tabs>
@@ -6410,11 +6446,11 @@
         <w:ind w:left="0" w:hanging="0"/>
       </w:pPr>
     </w:lvl>
-    <w:lvl w:ilvl="4">
+    <w:lvl w:ilvl="6">
       <w:start w:val="1"/>
       <w:numFmt w:val="none"/>
       <w:suff w:val="nothing"/>
-      <w:lvlText w:val="%5"/>
+      <w:lvlText w:val=""/>
       <w:lvlJc w:val="left"/>
       <w:pPr>
         <w:tabs>
@@ -6423,11 +6459,11 @@
         <w:ind w:left="0" w:hanging="0"/>
       </w:pPr>
     </w:lvl>
-    <w:lvl w:ilvl="5">
+    <w:lvl w:ilvl="7">
       <w:start w:val="1"/>
       <w:numFmt w:val="none"/>
       <w:suff w:val="nothing"/>
-      <w:lvlText w:val="%6"/>
+      <w:lvlText w:val=""/>
       <w:lvlJc w:val="left"/>
       <w:pPr>
         <w:tabs>
@@ -6436,37 +6472,11 @@
         <w:ind w:left="0" w:hanging="0"/>
       </w:pPr>
     </w:lvl>
-    <w:lvl w:ilvl="6">
+    <w:lvl w:ilvl="8">
       <w:start w:val="1"/>
       <w:numFmt w:val="none"/>
       <w:suff w:val="nothing"/>
-      <w:lvlText w:val="%7"/>
-      <w:lvlJc w:val="left"/>
-      <w:pPr>
-        <w:tabs>
-          <w:tab w:val="num" w:pos="0"/>
-        </w:tabs>
-        <w:ind w:left="0" w:hanging="0"/>
-      </w:pPr>
-    </w:lvl>
-    <w:lvl w:ilvl="7">
-      <w:start w:val="1"/>
-      <w:numFmt w:val="none"/>
-      <w:suff w:val="nothing"/>
-      <w:lvlText w:val="%8"/>
-      <w:lvlJc w:val="left"/>
-      <w:pPr>
-        <w:tabs>
-          <w:tab w:val="num" w:pos="0"/>
-        </w:tabs>
-        <w:ind w:left="0" w:hanging="0"/>
-      </w:pPr>
-    </w:lvl>
-    <w:lvl w:ilvl="8">
-      <w:start w:val="1"/>
-      <w:numFmt w:val="none"/>
-      <w:suff w:val="nothing"/>
-      <w:lvlText w:val="%9"/>
+      <w:lvlText w:val=""/>
       <w:lvlJc w:val="left"/>
       <w:pPr>
         <w:tabs>
@@ -6511,7 +6521,7 @@
   <w:docDefaults>
     <w:rPrDefault>
       <w:rPr>
-        <w:rFonts w:ascii="Liberation Serif" w:hAnsi="Liberation Serif" w:eastAsia="WenQuanYi Zen Hei" w:cs="FreeSans"/>
+        <w:rFonts w:ascii="Liberation Serif" w:hAnsi="Liberation Serif" w:eastAsia="Noto Serif CJK SC" w:cs="Noto Sans Devanagari"/>
         <w:sz w:val="24"/>
         <w:szCs w:val="24"/>
         <w:lang w:val="en-US" w:eastAsia="zh-CN" w:bidi="hi-IN"/>
@@ -6541,7 +6551,7 @@
     </w:rPr>
   </w:style>
   <w:style w:type="paragraph" w:styleId="Heading1">
-    <w:name w:val="Heading 1"/>
+    <w:name w:val="heading 1"/>
     <w:basedOn w:val="Heading"/>
     <w:next w:val="BodyText"/>
     <w:qFormat/>
@@ -6549,7 +6559,6 @@
       <w:spacing w:before="240" w:after="80"/>
     </w:pPr>
     <w:rPr>
-      <w:rFonts w:ascii="Noto Sans" w:hAnsi="Noto Sans"/>
       <w:b/>
       <w:bCs/>
       <w:color w:val="88C0D0"/>
@@ -6558,7 +6567,7 @@
     </w:rPr>
   </w:style>
   <w:style w:type="paragraph" w:styleId="Heading2">
-    <w:name w:val="Heading 2"/>
+    <w:name w:val="heading 2"/>
     <w:basedOn w:val="Heading"/>
     <w:next w:val="BodyText"/>
     <w:qFormat/>
@@ -6571,7 +6580,7 @@
       <w:outlineLvl w:val="1"/>
     </w:pPr>
     <w:rPr>
-      <w:rFonts w:ascii="Liberation Serif" w:hAnsi="Liberation Serif" w:eastAsia="WenQuanYi Zen Hei" w:cs="FreeSans"/>
+      <w:rFonts w:ascii="Liberation Serif" w:hAnsi="Liberation Serif" w:eastAsia="Noto Serif CJK SC" w:cs="Noto Sans Devanagari"/>
       <w:b/>
       <w:bCs/>
       <w:color w:val="88C0D0"/>
@@ -6580,7 +6589,7 @@
     </w:rPr>
   </w:style>
   <w:style w:type="paragraph" w:styleId="Heading3">
-    <w:name w:val="Heading 3"/>
+    <w:name w:val="heading 3"/>
     <w:basedOn w:val="Heading"/>
     <w:next w:val="BodyText"/>
     <w:qFormat/>
@@ -6590,12 +6599,24 @@
       <w:outlineLvl w:val="2"/>
     </w:pPr>
     <w:rPr>
-      <w:rFonts w:ascii="Liberation Serif" w:hAnsi="Liberation Serif" w:eastAsia="WenQuanYi Zen Hei" w:cs="FreeSans"/>
+      <w:rFonts w:ascii="Liberation Serif" w:hAnsi="Liberation Serif" w:eastAsia="Noto Serif CJK SC" w:cs="Noto Sans Devanagari"/>
       <w:b/>
       <w:bCs/>
       <w:color w:val="88C0D0"/>
       <w:sz w:val="26"/>
       <w:szCs w:val="26"/>
+    </w:rPr>
+  </w:style>
+  <w:style w:type="character" w:styleId="EndnoteReference">
+    <w:name w:val="endnote reference"/>
+    <w:rPr>
+      <w:vertAlign w:val="superscript"/>
+    </w:rPr>
+  </w:style>
+  <w:style w:type="character" w:styleId="FootnoteReference">
+    <w:name w:val="footnote reference"/>
+    <w:rPr>
+      <w:vertAlign w:val="superscript"/>
     </w:rPr>
   </w:style>
   <w:style w:type="character" w:styleId="EndnoteCharacters">
@@ -6675,7 +6696,7 @@
     </w:rPr>
   </w:style>
   <w:style w:type="paragraph" w:styleId="EnvelopeReturn">
-    <w:name w:val="Envelope Return"/>
+    <w:name w:val="envelope return"/>
     <w:basedOn w:val="Normal"/>
     <w:pPr/>
     <w:rPr>
@@ -6694,46 +6715,6 @@
       <w:color w:val="ECEFF4"/>
     </w:rPr>
   </w:style>
-  <w:style w:type="paragraph" w:styleId="Footer">
-    <w:name w:val="Footer"/>
-    <w:basedOn w:val="Normal"/>
-    <w:pPr>
-      <w:suppressLineNumbers/>
-      <w:tabs>
-        <w:tab w:val="clear" w:pos="1134"/>
-        <w:tab w:val="center" w:pos="5952" w:leader="none"/>
-        <w:tab w:val="right" w:pos="10771" w:leader="none"/>
-      </w:tabs>
-    </w:pPr>
-    <w:rPr/>
-  </w:style>
-  <w:style w:type="paragraph" w:styleId="Header">
-    <w:name w:val="Header"/>
-    <w:basedOn w:val="Normal"/>
-    <w:pPr>
-      <w:suppressLineNumbers/>
-      <w:tabs>
-        <w:tab w:val="clear" w:pos="1134"/>
-        <w:tab w:val="center" w:pos="5952" w:leader="none"/>
-        <w:tab w:val="right" w:pos="10771" w:leader="none"/>
-      </w:tabs>
-    </w:pPr>
-    <w:rPr/>
-  </w:style>
-  <w:style w:type="paragraph" w:styleId="HeaderandFooter">
-    <w:name w:val="Header and Footer"/>
-    <w:basedOn w:val="Normal"/>
-    <w:qFormat/>
-    <w:pPr>
-      <w:suppressLineNumbers/>
-      <w:tabs>
-        <w:tab w:val="clear" w:pos="1134"/>
-        <w:tab w:val="center" w:pos="5953" w:leader="none"/>
-        <w:tab w:val="right" w:pos="10772" w:leader="none"/>
-      </w:tabs>
-    </w:pPr>
-    <w:rPr/>
-  </w:style>
   <w:style w:type="paragraph" w:styleId="Index">
     <w:name w:val="Index"/>
     <w:basedOn w:val="Normal"/>
@@ -6742,11 +6723,11 @@
       <w:suppressLineNumbers/>
     </w:pPr>
     <w:rPr>
-      <w:rFonts w:cs="FreeSans"/>
+      <w:rFonts w:cs="Noto Sans Devanagari"/>
     </w:rPr>
   </w:style>
   <w:style w:type="paragraph" w:styleId="Caption">
-    <w:name w:val="Caption"/>
+    <w:name w:val="caption"/>
     <w:basedOn w:val="Normal"/>
     <w:qFormat/>
     <w:pPr>
@@ -6754,7 +6735,7 @@
       <w:spacing w:before="120" w:after="120"/>
     </w:pPr>
     <w:rPr>
-      <w:rFonts w:cs="FreeSans"/>
+      <w:rFonts w:cs="Noto Sans Devanagari"/>
       <w:i/>
       <w:iCs/>
       <w:sz w:val="24"/>
@@ -6766,7 +6747,7 @@
     <w:basedOn w:val="BodyText"/>
     <w:pPr/>
     <w:rPr>
-      <w:rFonts w:cs="FreeSans"/>
+      <w:rFonts w:cs="Noto Sans Devanagari"/>
     </w:rPr>
   </w:style>
   <w:style w:type="paragraph" w:styleId="BodyText">
@@ -6808,7 +6789,7 @@
       <w:ind w:left="160" w:right="160"/>
     </w:pPr>
     <w:rPr>
-      <w:rFonts w:ascii="Liberation Mono" w:hAnsi="Liberation Mono" w:eastAsia="Liberation Mono" w:cs="Liberation Mono"/>
+      <w:rFonts w:ascii="Liberation Mono" w:hAnsi="Liberation Mono" w:eastAsia="Noto Sans Mono CJK SC" w:cs="Liberation Mono"/>
       <w:sz w:val="20"/>
       <w:szCs w:val="20"/>
     </w:rPr>
@@ -6839,37 +6820,37 @@
         <a:srgbClr val="000000"/>
       </a:dk1>
       <a:lt1>
-        <a:srgbClr val="ffffff"/>
+        <a:srgbClr val="FFFFFF"/>
       </a:lt1>
       <a:dk2>
         <a:srgbClr val="000000"/>
       </a:dk2>
       <a:lt2>
-        <a:srgbClr val="ffffff"/>
+        <a:srgbClr val="FFFFFF"/>
       </a:lt2>
       <a:accent1>
-        <a:srgbClr val="18a303"/>
+        <a:srgbClr val="18A303"/>
       </a:accent1>
       <a:accent2>
-        <a:srgbClr val="0369a3"/>
+        <a:srgbClr val="0369A3"/>
       </a:accent2>
       <a:accent3>
-        <a:srgbClr val="a33e03"/>
+        <a:srgbClr val="A33E03"/>
       </a:accent3>
       <a:accent4>
-        <a:srgbClr val="8e03a3"/>
+        <a:srgbClr val="8E03A3"/>
       </a:accent4>
       <a:accent5>
-        <a:srgbClr val="c99c00"/>
+        <a:srgbClr val="C99C00"/>
       </a:accent5>
       <a:accent6>
-        <a:srgbClr val="c9211e"/>
+        <a:srgbClr val="C9211E"/>
       </a:accent6>
       <a:hlink>
-        <a:srgbClr val="0000ee"/>
+        <a:srgbClr val="0000EE"/>
       </a:hlink>
       <a:folHlink>
-        <a:srgbClr val="551a8b"/>
+        <a:srgbClr val="551A8B"/>
       </a:folHlink>
     </a:clrScheme>
     <a:fontScheme name="Office">

</xml_diff>

<commit_message>
L-0703: review round 1 fixes
- promote-gate.sh: the deadline is taken first, backdated by SECONDS; the
  no-python jq fallback is bounded by it (timeout, else block), reports a
  hit as JSON so a newline-only value cannot read as no match, and checks
  jq's status when reading the payload.
- _promote_review.py: reads the map once and only when its bytes are the
  map committed at HEAD (an opt-out written after the gate's dirty-map
  check cannot waive review); the budget is taken after the map read; a
  search child that exits non-zero never covers; taskkill is found in
  System32 when PATH lacks it.
- Both flavours name a short row of any length.
- Guide states the two limits of the review evidence.
- Tests for each, and four new mutations (all RED); the slow-python case
  asserts its hung git was reached.
</commit_message>
<xml_diff>
--- a/docs/guides/crew/crew-guide.docx
+++ b/docs/guides/crew/crew-guide.docx
@@ -2694,7 +2694,37 @@
       </w:r>
       <w:r>
         <w:rPr/>
-        <w:t xml:space="preserve"> and a reason), and that the tree is clean.</w:t>
+        <w:t xml:space="preserve"> and a reason), and that the tree is clean. The review evidence proves only that the tracked tree deployed is one a reviewer was shown under a standing receipt: it does not prove that paths the review bundle left out (identical to merged main, or under </w:t>
+      </w:r>
+      <w:r>
+        <w:rPr>
+          <w:rStyle w:val="SourceText"/>
+        </w:rPr>
+        <w:t>.work/</w:t>
+      </w:r>
+      <w:r>
+        <w:rPr/>
+        <w:t xml:space="preserve">, </w:t>
+      </w:r>
+      <w:r>
+        <w:rPr>
+          <w:rStyle w:val="SourceText"/>
+        </w:rPr>
+        <w:t>graphify-out/</w:t>
+      </w:r>
+      <w:r>
+        <w:rPr/>
+        <w:t xml:space="preserve">, </w:t>
+      </w:r>
+      <w:r>
+        <w:rPr>
+          <w:rStyle w:val="SourceText"/>
+        </w:rPr>
+        <w:t>.crew/metrics.md</w:t>
+      </w:r>
+      <w:r>
+        <w:rPr/>
+        <w:t>) or ignored build output a deploy script ships were reviewed, nor who wrote the local ledger.</w:t>
       </w:r>
     </w:p>
     <w:p>

</xml_diff>

<commit_message>
crew: L-0667 /crew:graph - one command for graph status, the sanctioned refresh and the pair check (#455)
crew_graph.py status/refresh; the refresh check's graph artifact names /crew:graph --refresh and
carries the graphify line in runs (graph_command keeps the sabotage-anchored line byte-identical);
37 commands everywhere the count is stated, both install scripts alike.

Claude-Session: https://claude.ai/code/session_01H49aKnVMcvefcadqBGmuMu
</commit_message>
<xml_diff>
--- a/docs/guides/crew/crew-guide.docx
+++ b/docs/guides/crew/crew-guide.docx
@@ -129,7 +129,7 @@
     </w:p>
     <w:tbl>
       <w:tblPr>
-        <w:tblW w:w="3888" w:type="dxa"/>
+        <w:tblW w:w="3783" w:type="dxa"/>
         <w:jc w:val="left"/>
         <w:tblInd w:w="0" w:type="dxa"/>
         <w:tblLayout w:type="fixed"/>
@@ -142,8 +142,8 @@
       </w:tblPr>
       <w:tblGrid>
         <w:gridCol w:w="1411"/>
-        <w:gridCol w:w="1351"/>
-        <w:gridCol w:w="1126"/>
+        <w:gridCol w:w="1306"/>
+        <w:gridCol w:w="1066"/>
       </w:tblGrid>
       <w:tr>
         <w:trPr>
@@ -173,7 +173,7 @@
         </w:tc>
         <w:tc>
           <w:tcPr>
-            <w:tcW w:w="1351" w:type="dxa"/>
+            <w:tcW w:w="1306" w:type="dxa"/>
             <w:tcBorders/>
             <w:vAlign w:val="center"/>
           </w:tcPr>
@@ -195,7 +195,7 @@
         </w:tc>
         <w:tc>
           <w:tcPr>
-            <w:tcW w:w="1126" w:type="dxa"/>
+            <w:tcW w:w="1066" w:type="dxa"/>
             <w:tcBorders/>
             <w:vAlign w:val="center"/>
           </w:tcPr>
@@ -243,7 +243,7 @@
         </w:tc>
         <w:tc>
           <w:tcPr>
-            <w:tcW w:w="1351" w:type="dxa"/>
+            <w:tcW w:w="1306" w:type="dxa"/>
             <w:tcBorders/>
             <w:vAlign w:val="center"/>
           </w:tcPr>
@@ -264,7 +264,7 @@
         </w:tc>
         <w:tc>
           <w:tcPr>
-            <w:tcW w:w="1126" w:type="dxa"/>
+            <w:tcW w:w="1066" w:type="dxa"/>
             <w:tcBorders/>
             <w:vAlign w:val="center"/>
           </w:tcPr>
@@ -311,7 +311,7 @@
         </w:tc>
         <w:tc>
           <w:tcPr>
-            <w:tcW w:w="1351" w:type="dxa"/>
+            <w:tcW w:w="1306" w:type="dxa"/>
             <w:tcBorders/>
             <w:vAlign w:val="center"/>
           </w:tcPr>
@@ -332,7 +332,7 @@
         </w:tc>
         <w:tc>
           <w:tcPr>
-            <w:tcW w:w="1126" w:type="dxa"/>
+            <w:tcW w:w="1066" w:type="dxa"/>
             <w:tcBorders/>
             <w:vAlign w:val="center"/>
           </w:tcPr>
@@ -379,7 +379,7 @@
         </w:tc>
         <w:tc>
           <w:tcPr>
-            <w:tcW w:w="1351" w:type="dxa"/>
+            <w:tcW w:w="1306" w:type="dxa"/>
             <w:tcBorders/>
             <w:vAlign w:val="center"/>
           </w:tcPr>
@@ -400,7 +400,7 @@
         </w:tc>
         <w:tc>
           <w:tcPr>
-            <w:tcW w:w="1126" w:type="dxa"/>
+            <w:tcW w:w="1066" w:type="dxa"/>
             <w:tcBorders/>
             <w:vAlign w:val="center"/>
           </w:tcPr>
@@ -447,7 +447,7 @@
         </w:tc>
         <w:tc>
           <w:tcPr>
-            <w:tcW w:w="1351" w:type="dxa"/>
+            <w:tcW w:w="1306" w:type="dxa"/>
             <w:tcBorders/>
             <w:vAlign w:val="center"/>
           </w:tcPr>
@@ -468,7 +468,7 @@
         </w:tc>
         <w:tc>
           <w:tcPr>
-            <w:tcW w:w="1126" w:type="dxa"/>
+            <w:tcW w:w="1066" w:type="dxa"/>
             <w:tcBorders/>
             <w:vAlign w:val="center"/>
           </w:tcPr>
@@ -2182,7 +2182,7 @@
         <w:rPr>
           <w:rStyle w:val="SourceText"/>
         </w:rPr>
-        <w:t>graphify update .</w:t>
+        <w:t>/crew:graph --refresh</w:t>
       </w:r>
       <w:r>
         <w:rPr/>
@@ -4616,7 +4616,7 @@
     </w:p>
     <w:tbl>
       <w:tblPr>
-        <w:tblW w:w="3888" w:type="dxa"/>
+        <w:tblW w:w="3783" w:type="dxa"/>
         <w:jc w:val="left"/>
         <w:tblInd w:w="0" w:type="dxa"/>
         <w:tblLayout w:type="fixed"/>
@@ -4628,8 +4628,8 @@
         </w:tblCellMar>
       </w:tblPr>
       <w:tblGrid>
-        <w:gridCol w:w="1007"/>
-        <w:gridCol w:w="2881"/>
+        <w:gridCol w:w="941"/>
+        <w:gridCol w:w="2842"/>
       </w:tblGrid>
       <w:tr>
         <w:trPr>
@@ -4637,7 +4637,7 @@
         </w:trPr>
         <w:tc>
           <w:tcPr>
-            <w:tcW w:w="1007" w:type="dxa"/>
+            <w:tcW w:w="941" w:type="dxa"/>
             <w:tcBorders/>
             <w:vAlign w:val="center"/>
           </w:tcPr>
@@ -4659,7 +4659,7 @@
         </w:tc>
         <w:tc>
           <w:tcPr>
-            <w:tcW w:w="2881" w:type="dxa"/>
+            <w:tcW w:w="2842" w:type="dxa"/>
             <w:tcBorders/>
             <w:vAlign w:val="center"/>
           </w:tcPr>
@@ -4684,7 +4684,7 @@
         <w:trPr/>
         <w:tc>
           <w:tcPr>
-            <w:tcW w:w="1007" w:type="dxa"/>
+            <w:tcW w:w="941" w:type="dxa"/>
             <w:tcBorders/>
             <w:vAlign w:val="center"/>
           </w:tcPr>
@@ -4705,7 +4705,7 @@
         </w:tc>
         <w:tc>
           <w:tcPr>
-            <w:tcW w:w="2881" w:type="dxa"/>
+            <w:tcW w:w="2842" w:type="dxa"/>
             <w:tcBorders/>
             <w:vAlign w:val="center"/>
           </w:tcPr>
@@ -4729,7 +4729,7 @@
         <w:trPr/>
         <w:tc>
           <w:tcPr>
-            <w:tcW w:w="1007" w:type="dxa"/>
+            <w:tcW w:w="941" w:type="dxa"/>
             <w:tcBorders/>
             <w:vAlign w:val="center"/>
           </w:tcPr>
@@ -4750,7 +4750,7 @@
         </w:tc>
         <w:tc>
           <w:tcPr>
-            <w:tcW w:w="2881" w:type="dxa"/>
+            <w:tcW w:w="2842" w:type="dxa"/>
             <w:tcBorders/>
             <w:vAlign w:val="center"/>
           </w:tcPr>
@@ -4774,7 +4774,7 @@
         <w:trPr/>
         <w:tc>
           <w:tcPr>
-            <w:tcW w:w="1007" w:type="dxa"/>
+            <w:tcW w:w="941" w:type="dxa"/>
             <w:tcBorders/>
             <w:vAlign w:val="center"/>
           </w:tcPr>
@@ -4795,7 +4795,7 @@
         </w:tc>
         <w:tc>
           <w:tcPr>
-            <w:tcW w:w="2881" w:type="dxa"/>
+            <w:tcW w:w="2842" w:type="dxa"/>
             <w:tcBorders/>
             <w:vAlign w:val="center"/>
           </w:tcPr>
@@ -4821,7 +4821,7 @@
         <w:trPr/>
         <w:tc>
           <w:tcPr>
-            <w:tcW w:w="1007" w:type="dxa"/>
+            <w:tcW w:w="941" w:type="dxa"/>
             <w:tcBorders/>
             <w:vAlign w:val="center"/>
           </w:tcPr>
@@ -4842,7 +4842,7 @@
         </w:tc>
         <w:tc>
           <w:tcPr>
-            <w:tcW w:w="2881" w:type="dxa"/>
+            <w:tcW w:w="2842" w:type="dxa"/>
             <w:tcBorders/>
             <w:vAlign w:val="center"/>
           </w:tcPr>
@@ -4866,7 +4866,7 @@
         <w:trPr/>
         <w:tc>
           <w:tcPr>
-            <w:tcW w:w="1007" w:type="dxa"/>
+            <w:tcW w:w="941" w:type="dxa"/>
             <w:tcBorders/>
             <w:vAlign w:val="center"/>
           </w:tcPr>
@@ -4887,7 +4887,7 @@
         </w:tc>
         <w:tc>
           <w:tcPr>
-            <w:tcW w:w="2881" w:type="dxa"/>
+            <w:tcW w:w="2842" w:type="dxa"/>
             <w:tcBorders/>
             <w:vAlign w:val="center"/>
           </w:tcPr>
@@ -4911,7 +4911,7 @@
         <w:trPr/>
         <w:tc>
           <w:tcPr>
-            <w:tcW w:w="1007" w:type="dxa"/>
+            <w:tcW w:w="941" w:type="dxa"/>
             <w:tcBorders/>
             <w:vAlign w:val="center"/>
           </w:tcPr>
@@ -4932,7 +4932,7 @@
         </w:tc>
         <w:tc>
           <w:tcPr>
-            <w:tcW w:w="2881" w:type="dxa"/>
+            <w:tcW w:w="2842" w:type="dxa"/>
             <w:tcBorders/>
             <w:vAlign w:val="center"/>
           </w:tcPr>
@@ -4956,7 +4956,7 @@
         <w:trPr/>
         <w:tc>
           <w:tcPr>
-            <w:tcW w:w="1007" w:type="dxa"/>
+            <w:tcW w:w="941" w:type="dxa"/>
             <w:tcBorders/>
             <w:vAlign w:val="center"/>
           </w:tcPr>
@@ -4977,7 +4977,7 @@
         </w:tc>
         <w:tc>
           <w:tcPr>
-            <w:tcW w:w="2881" w:type="dxa"/>
+            <w:tcW w:w="2842" w:type="dxa"/>
             <w:tcBorders/>
             <w:vAlign w:val="center"/>
           </w:tcPr>
@@ -5011,7 +5011,7 @@
         <w:trPr/>
         <w:tc>
           <w:tcPr>
-            <w:tcW w:w="1007" w:type="dxa"/>
+            <w:tcW w:w="941" w:type="dxa"/>
             <w:tcBorders/>
             <w:vAlign w:val="center"/>
           </w:tcPr>
@@ -5032,7 +5032,7 @@
         </w:tc>
         <w:tc>
           <w:tcPr>
-            <w:tcW w:w="2881" w:type="dxa"/>
+            <w:tcW w:w="2842" w:type="dxa"/>
             <w:tcBorders/>
             <w:vAlign w:val="center"/>
           </w:tcPr>
@@ -5056,7 +5056,7 @@
         <w:trPr/>
         <w:tc>
           <w:tcPr>
-            <w:tcW w:w="1007" w:type="dxa"/>
+            <w:tcW w:w="941" w:type="dxa"/>
             <w:tcBorders/>
             <w:vAlign w:val="center"/>
           </w:tcPr>
@@ -5077,7 +5077,7 @@
         </w:tc>
         <w:tc>
           <w:tcPr>
-            <w:tcW w:w="2881" w:type="dxa"/>
+            <w:tcW w:w="2842" w:type="dxa"/>
             <w:tcBorders/>
             <w:vAlign w:val="center"/>
           </w:tcPr>
@@ -5101,7 +5101,7 @@
         <w:trPr/>
         <w:tc>
           <w:tcPr>
-            <w:tcW w:w="1007" w:type="dxa"/>
+            <w:tcW w:w="941" w:type="dxa"/>
             <w:tcBorders/>
             <w:vAlign w:val="center"/>
           </w:tcPr>
@@ -5122,7 +5122,7 @@
         </w:tc>
         <w:tc>
           <w:tcPr>
-            <w:tcW w:w="2881" w:type="dxa"/>
+            <w:tcW w:w="2842" w:type="dxa"/>
             <w:tcBorders/>
             <w:vAlign w:val="center"/>
           </w:tcPr>

</xml_diff>

<commit_message>
rush 1.2.1: re-measure budgets, rebuild the guides, update L-0703's rule note
- plugin/crew/.budget-allowance.json: promote.md measures 394 lines once
  L-0703's gate-1 text meets main 1.2.0's workflow-dispatch text (allowance
  392 on L-0703, 380 on main); raised to the measured 394.
- plugin/crew/BUDGETS.md: re-measured, 27,649 lines across 157 files.
- docs/guides/crew: crew-guide and crew-troubleshooting .docx/.pdf rebuilt
  with build.py (the merges took main's binaries, which lack L-0703's guide
  text); the HTML was already current (build.py --check).
- .crew/verify.json: L-0703's rule said its mutations run by hand until a
  tooling PR wires them into sabotage.py; C-0046 did that in crew 1.2.0.

Claude-Session: https://claude.ai/code/session_01H49aKnVMcvefcadqBGmuMu
</commit_message>
<xml_diff>
--- a/docs/guides/crew/crew-guide.docx
+++ b/docs/guides/crew/crew-guide.docx
@@ -2806,7 +2806,7 @@
       </w:r>
       <w:r>
         <w:rPr/>
-        <w:t xml:space="preserve">. Before the deploy it checks that the upstream environment passed for this exact sha, that a rollback is declared, that a person approved it when </w:t>
+        <w:t xml:space="preserve">. Before the deploy it checks that the upstream environment passed for this exact sha (a promotion row carries the full sha), that a rollback is declared, that a person approved it when </w:t>
       </w:r>
       <w:r>
         <w:rPr>
@@ -2816,7 +2816,47 @@
       </w:r>
       <w:r>
         <w:rPr/>
-        <w:t xml:space="preserve"> is set, and that the tree is clean.</w:t>
+        <w:t xml:space="preserve"> is set, that an accepted review covers the exact tree being deployed (unless the environment opts out with </w:t>
+      </w:r>
+      <w:r>
+        <w:rPr>
+          <w:rStyle w:val="SourceText"/>
+        </w:rPr>
+        <w:t>requireReview: false</w:t>
+      </w:r>
+      <w:r>
+        <w:rPr/>
+        <w:t xml:space="preserve"> and a reason), and that the tree is clean. The review evidence proves only that the tracked tree deployed is one a reviewer was shown under a standing receipt: it does not prove that paths the review bundle left out (identical to merged main, or under </w:t>
+      </w:r>
+      <w:r>
+        <w:rPr>
+          <w:rStyle w:val="SourceText"/>
+        </w:rPr>
+        <w:t>.work/</w:t>
+      </w:r>
+      <w:r>
+        <w:rPr/>
+        <w:t xml:space="preserve">, </w:t>
+      </w:r>
+      <w:r>
+        <w:rPr>
+          <w:rStyle w:val="SourceText"/>
+        </w:rPr>
+        <w:t>graphify-out/</w:t>
+      </w:r>
+      <w:r>
+        <w:rPr/>
+        <w:t xml:space="preserve">, </w:t>
+      </w:r>
+      <w:r>
+        <w:rPr>
+          <w:rStyle w:val="SourceText"/>
+        </w:rPr>
+        <w:t>.crew/metrics.md</w:t>
+      </w:r>
+      <w:r>
+        <w:rPr/>
+        <w:t>) or ignored build output a deploy script ships were reviewed, nor who wrote the local ledger.</w:t>
       </w:r>
     </w:p>
     <w:p>

</xml_diff>

<commit_message>
L-0713: one true quickstart - crew 1.2.7
/crew:init writes .crew/config.json, the file crew reads; /crew:status no
longer tells a fresh repo to run /crew:migrate (only a 0.20 setup gets the
prompt). The quickstart, guides, README, CONFIG.md, init.md, migrate.md and
status.md now tell that one story. The four pm-*/developer-* evals and the
known-failure exemption are gone; the eval runners discover cases and say
'no eval cases' when there are none. check-marketplace.py gains the
crew-config-file, plugin-command-table and eval-roster claim kinds, which
found three commands missing from the two command tables.

Docs: updated - quickstart, guide, troubleshooting, memory guides (rebuilt),
plugin README, CONFIG.md, init/migrate/status commands, PLUGINS.md, codemap,
diagrams.
</commit_message>
<xml_diff>
--- a/docs/guides/crew/crew-guide.docx
+++ b/docs/guides/crew/crew-guide.docx
@@ -1,6 +1,6 @@
 
 <file path=word/document.xml><?xml version="1.0" encoding="utf-8"?>
-<w:document xmlns:o="urn:schemas-microsoft-com:office:office" xmlns:r="http://schemas.openxmlformats.org/officeDocument/2006/relationships" xmlns:v="urn:schemas-microsoft-com:vml" xmlns:w="http://schemas.openxmlformats.org/wordprocessingml/2006/main" xmlns:w10="urn:schemas-microsoft-com:office:word" xmlns:wp="http://schemas.openxmlformats.org/drawingml/2006/wordprocessingDrawing" xmlns:wps="http://schemas.microsoft.com/office/word/2010/wordprocessingShape" xmlns:wpg="http://schemas.microsoft.com/office/word/2010/wordprocessingGroup" xmlns:mc="http://schemas.openxmlformats.org/markup-compatibility/2006" xmlns:wp14="http://schemas.microsoft.com/office/word/2010/wordprocessingDrawing" xmlns:w14="http://schemas.microsoft.com/office/word/2010/wordml" xmlns:w15="http://schemas.microsoft.com/office/word/2012/wordml" mc:Ignorable="w14 wp14 w15">
+<w:document xmlns:o="urn:schemas-microsoft-com:office:office" xmlns:r="http://schemas.openxmlformats.org/officeDocument/2006/relationships" xmlns:v="urn:schemas-microsoft-com:vml" xmlns:w="http://schemas.openxmlformats.org/wordprocessingml/2006/main" xmlns:w10="urn:schemas-microsoft-com:office:word" xmlns:wp="http://schemas.openxmlformats.org/drawingml/2006/wordprocessingDrawing" xmlns:pic="http://schemas.openxmlformats.org/drawingml/2006/picture" xmlns:wps="http://schemas.microsoft.com/office/word/2010/wordprocessingShape" xmlns:wpg="http://schemas.microsoft.com/office/word/2010/wordprocessingGroup" xmlns:mc="http://schemas.openxmlformats.org/markup-compatibility/2006" xmlns:wp14="http://schemas.microsoft.com/office/word/2010/wordprocessingDrawing" xmlns:w14="http://schemas.microsoft.com/office/word/2010/wordml" xmlns:w15="http://schemas.microsoft.com/office/word/2012/wordml" mc:Ignorable="w14 wp14 w15">
   <w:body>
     <w:p>
       <w:pPr>
@@ -129,9 +129,9 @@
     </w:p>
     <w:tbl>
       <w:tblPr>
-        <w:tblW w:w="3783" w:type="dxa"/>
-        <w:jc w:val="left"/>
-        <w:tblInd w:w="0" w:type="dxa"/>
+        <w:tblW w:w="11339" w:type="dxa"/>
+        <w:jc w:val="left"/>
+        <w:tblInd w:w="28" w:type="dxa"/>
         <w:tblLayout w:type="fixed"/>
         <w:tblCellMar>
           <w:top w:w="28" w:type="dxa"/>
@@ -141,9 +141,9 @@
         </w:tblCellMar>
       </w:tblPr>
       <w:tblGrid>
-        <w:gridCol w:w="1411"/>
-        <w:gridCol w:w="1306"/>
-        <w:gridCol w:w="1066"/>
+        <w:gridCol w:w="1414"/>
+        <w:gridCol w:w="7248"/>
+        <w:gridCol w:w="2677"/>
       </w:tblGrid>
       <w:tr>
         <w:trPr>
@@ -151,7 +151,7 @@
         </w:trPr>
         <w:tc>
           <w:tcPr>
-            <w:tcW w:w="1411" w:type="dxa"/>
+            <w:tcW w:w="1414" w:type="dxa"/>
             <w:tcBorders/>
             <w:vAlign w:val="center"/>
           </w:tcPr>
@@ -173,7 +173,7 @@
         </w:tc>
         <w:tc>
           <w:tcPr>
-            <w:tcW w:w="1306" w:type="dxa"/>
+            <w:tcW w:w="7248" w:type="dxa"/>
             <w:tcBorders/>
             <w:vAlign w:val="center"/>
           </w:tcPr>
@@ -195,7 +195,7 @@
         </w:tc>
         <w:tc>
           <w:tcPr>
-            <w:tcW w:w="1066" w:type="dxa"/>
+            <w:tcW w:w="2677" w:type="dxa"/>
             <w:tcBorders/>
             <w:vAlign w:val="center"/>
           </w:tcPr>
@@ -220,7 +220,7 @@
         <w:trPr/>
         <w:tc>
           <w:tcPr>
-            <w:tcW w:w="1411" w:type="dxa"/>
+            <w:tcW w:w="1414" w:type="dxa"/>
             <w:tcBorders/>
             <w:vAlign w:val="center"/>
           </w:tcPr>
@@ -243,7 +243,7 @@
         </w:tc>
         <w:tc>
           <w:tcPr>
-            <w:tcW w:w="1306" w:type="dxa"/>
+            <w:tcW w:w="7248" w:type="dxa"/>
             <w:tcBorders/>
             <w:vAlign w:val="center"/>
           </w:tcPr>
@@ -264,7 +264,7 @@
         </w:tc>
         <w:tc>
           <w:tcPr>
-            <w:tcW w:w="1066" w:type="dxa"/>
+            <w:tcW w:w="2677" w:type="dxa"/>
             <w:tcBorders/>
             <w:vAlign w:val="center"/>
           </w:tcPr>
@@ -288,7 +288,7 @@
         <w:trPr/>
         <w:tc>
           <w:tcPr>
-            <w:tcW w:w="1411" w:type="dxa"/>
+            <w:tcW w:w="1414" w:type="dxa"/>
             <w:tcBorders/>
             <w:vAlign w:val="center"/>
           </w:tcPr>
@@ -311,7 +311,7 @@
         </w:tc>
         <w:tc>
           <w:tcPr>
-            <w:tcW w:w="1306" w:type="dxa"/>
+            <w:tcW w:w="7248" w:type="dxa"/>
             <w:tcBorders/>
             <w:vAlign w:val="center"/>
           </w:tcPr>
@@ -332,7 +332,7 @@
         </w:tc>
         <w:tc>
           <w:tcPr>
-            <w:tcW w:w="1066" w:type="dxa"/>
+            <w:tcW w:w="2677" w:type="dxa"/>
             <w:tcBorders/>
             <w:vAlign w:val="center"/>
           </w:tcPr>
@@ -356,7 +356,7 @@
         <w:trPr/>
         <w:tc>
           <w:tcPr>
-            <w:tcW w:w="1411" w:type="dxa"/>
+            <w:tcW w:w="1414" w:type="dxa"/>
             <w:tcBorders/>
             <w:vAlign w:val="center"/>
           </w:tcPr>
@@ -379,7 +379,7 @@
         </w:tc>
         <w:tc>
           <w:tcPr>
-            <w:tcW w:w="1306" w:type="dxa"/>
+            <w:tcW w:w="7248" w:type="dxa"/>
             <w:tcBorders/>
             <w:vAlign w:val="center"/>
           </w:tcPr>
@@ -400,7 +400,7 @@
         </w:tc>
         <w:tc>
           <w:tcPr>
-            <w:tcW w:w="1066" w:type="dxa"/>
+            <w:tcW w:w="2677" w:type="dxa"/>
             <w:tcBorders/>
             <w:vAlign w:val="center"/>
           </w:tcPr>
@@ -424,7 +424,7 @@
         <w:trPr/>
         <w:tc>
           <w:tcPr>
-            <w:tcW w:w="1411" w:type="dxa"/>
+            <w:tcW w:w="1414" w:type="dxa"/>
             <w:tcBorders/>
             <w:vAlign w:val="center"/>
           </w:tcPr>
@@ -447,7 +447,7 @@
         </w:tc>
         <w:tc>
           <w:tcPr>
-            <w:tcW w:w="1306" w:type="dxa"/>
+            <w:tcW w:w="7248" w:type="dxa"/>
             <w:tcBorders/>
             <w:vAlign w:val="center"/>
           </w:tcPr>
@@ -468,7 +468,7 @@
         </w:tc>
         <w:tc>
           <w:tcPr>
-            <w:tcW w:w="1066" w:type="dxa"/>
+            <w:tcW w:w="2677" w:type="dxa"/>
             <w:tcBorders/>
             <w:vAlign w:val="center"/>
           </w:tcPr>
@@ -984,11 +984,71 @@
         <w:rPr>
           <w:rStyle w:val="SourceText"/>
         </w:rPr>
+        <w:t>/crew:init</w:t>
+      </w:r>
+      <w:r>
+        <w:rPr/>
+        <w:t xml:space="preserve"> writes the repo config to </w:t>
+      </w:r>
+      <w:r>
+        <w:rPr>
+          <w:rStyle w:val="SourceText"/>
+        </w:rPr>
+        <w:t>.crew/config.json</w:t>
+      </w:r>
+      <w:r>
+        <w:rPr/>
+        <w:t xml:space="preserve">, the file every gate, guard and </w:t>
+      </w:r>
+      <w:r>
+        <w:rPr>
+          <w:rStyle w:val="SourceText"/>
+        </w:rPr>
+        <w:t>/crew:config</w:t>
+      </w:r>
+      <w:r>
+        <w:rPr/>
+        <w:t xml:space="preserve"> reads and writes; a new repository needs nothing else. </w:t>
+      </w:r>
+      <w:r>
+        <w:rPr>
+          <w:rStyle w:val="SourceText"/>
+        </w:rPr>
         <w:t>/crew:migrate</w:t>
       </w:r>
       <w:r>
         <w:rPr/>
-        <w:t xml:space="preserve"> moves a crew 0.20 repository to the 1.0 layout, once per repository: </w:t>
+        <w:t xml:space="preserve"> is only for a repository crew 0.20 set up (</w:t>
+      </w:r>
+      <w:r>
+        <w:rPr>
+          <w:rStyle w:val="SourceText"/>
+        </w:rPr>
+        <w:t>/crew:status</w:t>
+      </w:r>
+      <w:r>
+        <w:rPr/>
+        <w:t xml:space="preserve"> says </w:t>
+      </w:r>
+      <w:r>
+        <w:rPr>
+          <w:rStyle w:val="SourceText"/>
+        </w:rPr>
+        <w:t>run /crew:migrate</w:t>
+      </w:r>
+      <w:r>
+        <w:rPr/>
+        <w:t xml:space="preserve">): it moves the tickets, metrics and PM journal to the 1.0 layout and writes </w:t>
+      </w:r>
+      <w:r>
+        <w:rPr>
+          <w:rStyle w:val="SourceText"/>
+        </w:rPr>
+        <w:t>.crew/crew.json</w:t>
+      </w:r>
+      <w:r>
+        <w:rPr/>
+        <w:t xml:space="preserve"> as a record of the old config, once per repository: </w:t>
       </w:r>
       <w:r>
         <w:rPr>
@@ -1018,7 +1078,17 @@
       </w:r>
       <w:r>
         <w:rPr/>
-        <w:t xml:space="preserve"> restores. Every historical metric it cannot recover is written </w:t>
+        <w:t xml:space="preserve"> restores. </w:t>
+      </w:r>
+      <w:r>
+        <w:rPr>
+          <w:rStyle w:val="SourceText"/>
+        </w:rPr>
+        <w:t>.crew/config.json</w:t>
+      </w:r>
+      <w:r>
+        <w:rPr/>
+        <w:t xml:space="preserve"> stays, and stays the file crew reads its settings from. Every historical metric it cannot recover is written </w:t>
       </w:r>
       <w:r>
         <w:rPr>
@@ -4696,9 +4766,9 @@
     </w:p>
     <w:tbl>
       <w:tblPr>
-        <w:tblW w:w="3783" w:type="dxa"/>
-        <w:jc w:val="left"/>
-        <w:tblInd w:w="0" w:type="dxa"/>
+        <w:tblW w:w="10160" w:type="dxa"/>
+        <w:jc w:val="left"/>
+        <w:tblInd w:w="28" w:type="dxa"/>
         <w:tblLayout w:type="fixed"/>
         <w:tblCellMar>
           <w:top w:w="28" w:type="dxa"/>
@@ -4708,8 +4778,8 @@
         </w:tblCellMar>
       </w:tblPr>
       <w:tblGrid>
-        <w:gridCol w:w="941"/>
-        <w:gridCol w:w="2842"/>
+        <w:gridCol w:w="952"/>
+        <w:gridCol w:w="9208"/>
       </w:tblGrid>
       <w:tr>
         <w:trPr>
@@ -4717,7 +4787,7 @@
         </w:trPr>
         <w:tc>
           <w:tcPr>
-            <w:tcW w:w="941" w:type="dxa"/>
+            <w:tcW w:w="952" w:type="dxa"/>
             <w:tcBorders/>
             <w:vAlign w:val="center"/>
           </w:tcPr>
@@ -4739,7 +4809,7 @@
         </w:tc>
         <w:tc>
           <w:tcPr>
-            <w:tcW w:w="2842" w:type="dxa"/>
+            <w:tcW w:w="9208" w:type="dxa"/>
             <w:tcBorders/>
             <w:vAlign w:val="center"/>
           </w:tcPr>
@@ -4764,7 +4834,7 @@
         <w:trPr/>
         <w:tc>
           <w:tcPr>
-            <w:tcW w:w="941" w:type="dxa"/>
+            <w:tcW w:w="952" w:type="dxa"/>
             <w:tcBorders/>
             <w:vAlign w:val="center"/>
           </w:tcPr>
@@ -4785,7 +4855,7 @@
         </w:tc>
         <w:tc>
           <w:tcPr>
-            <w:tcW w:w="2842" w:type="dxa"/>
+            <w:tcW w:w="9208" w:type="dxa"/>
             <w:tcBorders/>
             <w:vAlign w:val="center"/>
           </w:tcPr>
@@ -4809,7 +4879,7 @@
         <w:trPr/>
         <w:tc>
           <w:tcPr>
-            <w:tcW w:w="941" w:type="dxa"/>
+            <w:tcW w:w="952" w:type="dxa"/>
             <w:tcBorders/>
             <w:vAlign w:val="center"/>
           </w:tcPr>
@@ -4830,7 +4900,7 @@
         </w:tc>
         <w:tc>
           <w:tcPr>
-            <w:tcW w:w="2842" w:type="dxa"/>
+            <w:tcW w:w="9208" w:type="dxa"/>
             <w:tcBorders/>
             <w:vAlign w:val="center"/>
           </w:tcPr>
@@ -4854,7 +4924,7 @@
         <w:trPr/>
         <w:tc>
           <w:tcPr>
-            <w:tcW w:w="941" w:type="dxa"/>
+            <w:tcW w:w="952" w:type="dxa"/>
             <w:tcBorders/>
             <w:vAlign w:val="center"/>
           </w:tcPr>
@@ -4875,7 +4945,7 @@
         </w:tc>
         <w:tc>
           <w:tcPr>
-            <w:tcW w:w="2842" w:type="dxa"/>
+            <w:tcW w:w="9208" w:type="dxa"/>
             <w:tcBorders/>
             <w:vAlign w:val="center"/>
           </w:tcPr>
@@ -4901,7 +4971,7 @@
         <w:trPr/>
         <w:tc>
           <w:tcPr>
-            <w:tcW w:w="941" w:type="dxa"/>
+            <w:tcW w:w="952" w:type="dxa"/>
             <w:tcBorders/>
             <w:vAlign w:val="center"/>
           </w:tcPr>
@@ -4922,7 +4992,7 @@
         </w:tc>
         <w:tc>
           <w:tcPr>
-            <w:tcW w:w="2842" w:type="dxa"/>
+            <w:tcW w:w="9208" w:type="dxa"/>
             <w:tcBorders/>
             <w:vAlign w:val="center"/>
           </w:tcPr>
@@ -4946,7 +5016,7 @@
         <w:trPr/>
         <w:tc>
           <w:tcPr>
-            <w:tcW w:w="941" w:type="dxa"/>
+            <w:tcW w:w="952" w:type="dxa"/>
             <w:tcBorders/>
             <w:vAlign w:val="center"/>
           </w:tcPr>
@@ -4967,7 +5037,7 @@
         </w:tc>
         <w:tc>
           <w:tcPr>
-            <w:tcW w:w="2842" w:type="dxa"/>
+            <w:tcW w:w="9208" w:type="dxa"/>
             <w:tcBorders/>
             <w:vAlign w:val="center"/>
           </w:tcPr>
@@ -4991,7 +5061,7 @@
         <w:trPr/>
         <w:tc>
           <w:tcPr>
-            <w:tcW w:w="941" w:type="dxa"/>
+            <w:tcW w:w="952" w:type="dxa"/>
             <w:tcBorders/>
             <w:vAlign w:val="center"/>
           </w:tcPr>
@@ -5012,7 +5082,7 @@
         </w:tc>
         <w:tc>
           <w:tcPr>
-            <w:tcW w:w="2842" w:type="dxa"/>
+            <w:tcW w:w="9208" w:type="dxa"/>
             <w:tcBorders/>
             <w:vAlign w:val="center"/>
           </w:tcPr>
@@ -5036,7 +5106,7 @@
         <w:trPr/>
         <w:tc>
           <w:tcPr>
-            <w:tcW w:w="941" w:type="dxa"/>
+            <w:tcW w:w="952" w:type="dxa"/>
             <w:tcBorders/>
             <w:vAlign w:val="center"/>
           </w:tcPr>
@@ -5057,7 +5127,7 @@
         </w:tc>
         <w:tc>
           <w:tcPr>
-            <w:tcW w:w="2842" w:type="dxa"/>
+            <w:tcW w:w="9208" w:type="dxa"/>
             <w:tcBorders/>
             <w:vAlign w:val="center"/>
           </w:tcPr>
@@ -5091,7 +5161,7 @@
         <w:trPr/>
         <w:tc>
           <w:tcPr>
-            <w:tcW w:w="941" w:type="dxa"/>
+            <w:tcW w:w="952" w:type="dxa"/>
             <w:tcBorders/>
             <w:vAlign w:val="center"/>
           </w:tcPr>
@@ -5112,7 +5182,7 @@
         </w:tc>
         <w:tc>
           <w:tcPr>
-            <w:tcW w:w="2842" w:type="dxa"/>
+            <w:tcW w:w="9208" w:type="dxa"/>
             <w:tcBorders/>
             <w:vAlign w:val="center"/>
           </w:tcPr>
@@ -5136,7 +5206,7 @@
         <w:trPr/>
         <w:tc>
           <w:tcPr>
-            <w:tcW w:w="941" w:type="dxa"/>
+            <w:tcW w:w="952" w:type="dxa"/>
             <w:tcBorders/>
             <w:vAlign w:val="center"/>
           </w:tcPr>
@@ -5157,7 +5227,7 @@
         </w:tc>
         <w:tc>
           <w:tcPr>
-            <w:tcW w:w="2842" w:type="dxa"/>
+            <w:tcW w:w="9208" w:type="dxa"/>
             <w:tcBorders/>
             <w:vAlign w:val="center"/>
           </w:tcPr>
@@ -5181,7 +5251,7 @@
         <w:trPr/>
         <w:tc>
           <w:tcPr>
-            <w:tcW w:w="941" w:type="dxa"/>
+            <w:tcW w:w="952" w:type="dxa"/>
             <w:tcBorders/>
             <w:vAlign w:val="center"/>
           </w:tcPr>
@@ -5202,7 +5272,7 @@
         </w:tc>
         <w:tc>
           <w:tcPr>
-            <w:tcW w:w="2842" w:type="dxa"/>
+            <w:tcW w:w="9208" w:type="dxa"/>
             <w:tcBorders/>
             <w:vAlign w:val="center"/>
           </w:tcPr>
@@ -6552,7 +6622,7 @@
       <w:start w:val="1"/>
       <w:numFmt w:val="none"/>
       <w:suff w:val="nothing"/>
-      <w:lvlText w:val="%1"/>
+      <w:lvlText w:val=""/>
       <w:lvlJc w:val="left"/>
       <w:pPr>
         <w:tabs>
@@ -6563,10 +6633,37 @@
     </w:lvl>
     <w:lvl w:ilvl="1">
       <w:start w:val="1"/>
+      <w:numFmt w:val="none"/>
       <w:pStyle w:val="Heading2"/>
+      <w:suff w:val="nothing"/>
+      <w:lvlText w:val=""/>
+      <w:lvlJc w:val="left"/>
+      <w:pPr>
+        <w:tabs>
+          <w:tab w:val="num" w:pos="0"/>
+        </w:tabs>
+        <w:ind w:left="0" w:hanging="0"/>
+      </w:pPr>
+    </w:lvl>
+    <w:lvl w:ilvl="2">
+      <w:start w:val="1"/>
+      <w:numFmt w:val="none"/>
+      <w:pStyle w:val="Heading3"/>
+      <w:suff w:val="nothing"/>
+      <w:lvlText w:val=""/>
+      <w:lvlJc w:val="left"/>
+      <w:pPr>
+        <w:tabs>
+          <w:tab w:val="num" w:pos="0"/>
+        </w:tabs>
+        <w:ind w:left="0" w:hanging="0"/>
+      </w:pPr>
+    </w:lvl>
+    <w:lvl w:ilvl="3">
+      <w:start w:val="1"/>
       <w:numFmt w:val="none"/>
       <w:suff w:val="nothing"/>
-      <w:lvlText w:val="%2"/>
+      <w:lvlText w:val=""/>
       <w:lvlJc w:val="left"/>
       <w:pPr>
         <w:tabs>
@@ -6575,12 +6672,11 @@
         <w:ind w:left="0" w:hanging="0"/>
       </w:pPr>
     </w:lvl>
-    <w:lvl w:ilvl="2">
-      <w:start w:val="1"/>
-      <w:pStyle w:val="Heading3"/>
+    <w:lvl w:ilvl="4">
+      <w:start w:val="1"/>
       <w:numFmt w:val="none"/>
       <w:suff w:val="nothing"/>
-      <w:lvlText w:val="%3"/>
+      <w:lvlText w:val=""/>
       <w:lvlJc w:val="left"/>
       <w:pPr>
         <w:tabs>
@@ -6589,11 +6685,11 @@
         <w:ind w:left="0" w:hanging="0"/>
       </w:pPr>
     </w:lvl>
-    <w:lvl w:ilvl="3">
+    <w:lvl w:ilvl="5">
       <w:start w:val="1"/>
       <w:numFmt w:val="none"/>
       <w:suff w:val="nothing"/>
-      <w:lvlText w:val="%4"/>
+      <w:lvlText w:val=""/>
       <w:lvlJc w:val="left"/>
       <w:pPr>
         <w:tabs>
@@ -6602,11 +6698,11 @@
         <w:ind w:left="0" w:hanging="0"/>
       </w:pPr>
     </w:lvl>
-    <w:lvl w:ilvl="4">
+    <w:lvl w:ilvl="6">
       <w:start w:val="1"/>
       <w:numFmt w:val="none"/>
       <w:suff w:val="nothing"/>
-      <w:lvlText w:val="%5"/>
+      <w:lvlText w:val=""/>
       <w:lvlJc w:val="left"/>
       <w:pPr>
         <w:tabs>
@@ -6615,11 +6711,11 @@
         <w:ind w:left="0" w:hanging="0"/>
       </w:pPr>
     </w:lvl>
-    <w:lvl w:ilvl="5">
+    <w:lvl w:ilvl="7">
       <w:start w:val="1"/>
       <w:numFmt w:val="none"/>
       <w:suff w:val="nothing"/>
-      <w:lvlText w:val="%6"/>
+      <w:lvlText w:val=""/>
       <w:lvlJc w:val="left"/>
       <w:pPr>
         <w:tabs>
@@ -6628,37 +6724,11 @@
         <w:ind w:left="0" w:hanging="0"/>
       </w:pPr>
     </w:lvl>
-    <w:lvl w:ilvl="6">
+    <w:lvl w:ilvl="8">
       <w:start w:val="1"/>
       <w:numFmt w:val="none"/>
       <w:suff w:val="nothing"/>
-      <w:lvlText w:val="%7"/>
-      <w:lvlJc w:val="left"/>
-      <w:pPr>
-        <w:tabs>
-          <w:tab w:val="num" w:pos="0"/>
-        </w:tabs>
-        <w:ind w:left="0" w:hanging="0"/>
-      </w:pPr>
-    </w:lvl>
-    <w:lvl w:ilvl="7">
-      <w:start w:val="1"/>
-      <w:numFmt w:val="none"/>
-      <w:suff w:val="nothing"/>
-      <w:lvlText w:val="%8"/>
-      <w:lvlJc w:val="left"/>
-      <w:pPr>
-        <w:tabs>
-          <w:tab w:val="num" w:pos="0"/>
-        </w:tabs>
-        <w:ind w:left="0" w:hanging="0"/>
-      </w:pPr>
-    </w:lvl>
-    <w:lvl w:ilvl="8">
-      <w:start w:val="1"/>
-      <w:numFmt w:val="none"/>
-      <w:suff w:val="nothing"/>
-      <w:lvlText w:val="%9"/>
+      <w:lvlText w:val=""/>
       <w:lvlJc w:val="left"/>
       <w:pPr>
         <w:tabs>
@@ -6703,7 +6773,7 @@
   <w:docDefaults>
     <w:rPrDefault>
       <w:rPr>
-        <w:rFonts w:ascii="Liberation Serif" w:hAnsi="Liberation Serif" w:eastAsia="WenQuanYi Zen Hei" w:cs="FreeSans"/>
+        <w:rFonts w:ascii="Liberation Serif" w:hAnsi="Liberation Serif" w:eastAsia="Noto Serif CJK SC" w:cs="Noto Sans Devanagari"/>
         <w:sz w:val="24"/>
         <w:szCs w:val="24"/>
         <w:lang w:val="en-US" w:eastAsia="zh-CN" w:bidi="hi-IN"/>
@@ -6733,7 +6803,7 @@
     </w:rPr>
   </w:style>
   <w:style w:type="paragraph" w:styleId="Heading1">
-    <w:name w:val="Heading 1"/>
+    <w:name w:val="heading 1"/>
     <w:basedOn w:val="Heading"/>
     <w:next w:val="BodyText"/>
     <w:qFormat/>
@@ -6741,7 +6811,6 @@
       <w:spacing w:before="240" w:after="80"/>
     </w:pPr>
     <w:rPr>
-      <w:rFonts w:ascii="Noto Sans" w:hAnsi="Noto Sans"/>
       <w:b/>
       <w:bCs/>
       <w:color w:val="88C0D0"/>
@@ -6750,7 +6819,7 @@
     </w:rPr>
   </w:style>
   <w:style w:type="paragraph" w:styleId="Heading2">
-    <w:name w:val="Heading 2"/>
+    <w:name w:val="heading 2"/>
     <w:basedOn w:val="Heading"/>
     <w:next w:val="BodyText"/>
     <w:qFormat/>
@@ -6763,7 +6832,7 @@
       <w:outlineLvl w:val="1"/>
     </w:pPr>
     <w:rPr>
-      <w:rFonts w:ascii="Liberation Serif" w:hAnsi="Liberation Serif" w:eastAsia="WenQuanYi Zen Hei" w:cs="FreeSans"/>
+      <w:rFonts w:ascii="Liberation Serif" w:hAnsi="Liberation Serif" w:eastAsia="Noto Serif CJK SC" w:cs="Noto Sans Devanagari"/>
       <w:b/>
       <w:bCs/>
       <w:color w:val="88C0D0"/>
@@ -6772,7 +6841,7 @@
     </w:rPr>
   </w:style>
   <w:style w:type="paragraph" w:styleId="Heading3">
-    <w:name w:val="Heading 3"/>
+    <w:name w:val="heading 3"/>
     <w:basedOn w:val="Heading"/>
     <w:next w:val="BodyText"/>
     <w:qFormat/>
@@ -6782,12 +6851,24 @@
       <w:outlineLvl w:val="2"/>
     </w:pPr>
     <w:rPr>
-      <w:rFonts w:ascii="Liberation Serif" w:hAnsi="Liberation Serif" w:eastAsia="WenQuanYi Zen Hei" w:cs="FreeSans"/>
+      <w:rFonts w:ascii="Liberation Serif" w:hAnsi="Liberation Serif" w:eastAsia="Noto Serif CJK SC" w:cs="Noto Sans Devanagari"/>
       <w:b/>
       <w:bCs/>
       <w:color w:val="88C0D0"/>
       <w:sz w:val="26"/>
       <w:szCs w:val="26"/>
+    </w:rPr>
+  </w:style>
+  <w:style w:type="character" w:styleId="EndnoteReference">
+    <w:name w:val="endnote reference"/>
+    <w:rPr>
+      <w:vertAlign w:val="superscript"/>
+    </w:rPr>
+  </w:style>
+  <w:style w:type="character" w:styleId="FootnoteReference">
+    <w:name w:val="footnote reference"/>
+    <w:rPr>
+      <w:vertAlign w:val="superscript"/>
     </w:rPr>
   </w:style>
   <w:style w:type="character" w:styleId="EndnoteCharacters">
@@ -6867,7 +6948,7 @@
     </w:rPr>
   </w:style>
   <w:style w:type="paragraph" w:styleId="EnvelopeReturn">
-    <w:name w:val="Envelope Return"/>
+    <w:name w:val="envelope return"/>
     <w:basedOn w:val="Normal"/>
     <w:pPr/>
     <w:rPr>
@@ -6886,46 +6967,6 @@
       <w:color w:val="ECEFF4"/>
     </w:rPr>
   </w:style>
-  <w:style w:type="paragraph" w:styleId="Footer">
-    <w:name w:val="Footer"/>
-    <w:basedOn w:val="Normal"/>
-    <w:pPr>
-      <w:suppressLineNumbers/>
-      <w:tabs>
-        <w:tab w:val="clear" w:pos="1134"/>
-        <w:tab w:val="center" w:pos="5952" w:leader="none"/>
-        <w:tab w:val="right" w:pos="10771" w:leader="none"/>
-      </w:tabs>
-    </w:pPr>
-    <w:rPr/>
-  </w:style>
-  <w:style w:type="paragraph" w:styleId="Header">
-    <w:name w:val="Header"/>
-    <w:basedOn w:val="Normal"/>
-    <w:pPr>
-      <w:suppressLineNumbers/>
-      <w:tabs>
-        <w:tab w:val="clear" w:pos="1134"/>
-        <w:tab w:val="center" w:pos="5952" w:leader="none"/>
-        <w:tab w:val="right" w:pos="10771" w:leader="none"/>
-      </w:tabs>
-    </w:pPr>
-    <w:rPr/>
-  </w:style>
-  <w:style w:type="paragraph" w:styleId="HeaderandFooter">
-    <w:name w:val="Header and Footer"/>
-    <w:basedOn w:val="Normal"/>
-    <w:qFormat/>
-    <w:pPr>
-      <w:suppressLineNumbers/>
-      <w:tabs>
-        <w:tab w:val="clear" w:pos="1134"/>
-        <w:tab w:val="center" w:pos="5953" w:leader="none"/>
-        <w:tab w:val="right" w:pos="10772" w:leader="none"/>
-      </w:tabs>
-    </w:pPr>
-    <w:rPr/>
-  </w:style>
   <w:style w:type="paragraph" w:styleId="Index">
     <w:name w:val="Index"/>
     <w:basedOn w:val="Normal"/>
@@ -6934,11 +6975,11 @@
       <w:suppressLineNumbers/>
     </w:pPr>
     <w:rPr>
-      <w:rFonts w:cs="FreeSans"/>
+      <w:rFonts w:cs="Noto Sans Devanagari"/>
     </w:rPr>
   </w:style>
   <w:style w:type="paragraph" w:styleId="Caption">
-    <w:name w:val="Caption"/>
+    <w:name w:val="caption"/>
     <w:basedOn w:val="Normal"/>
     <w:qFormat/>
     <w:pPr>
@@ -6946,7 +6987,7 @@
       <w:spacing w:before="120" w:after="120"/>
     </w:pPr>
     <w:rPr>
-      <w:rFonts w:cs="FreeSans"/>
+      <w:rFonts w:cs="Noto Sans Devanagari"/>
       <w:i/>
       <w:iCs/>
       <w:sz w:val="24"/>
@@ -6958,7 +6999,7 @@
     <w:basedOn w:val="BodyText"/>
     <w:pPr/>
     <w:rPr>
-      <w:rFonts w:cs="FreeSans"/>
+      <w:rFonts w:cs="Noto Sans Devanagari"/>
     </w:rPr>
   </w:style>
   <w:style w:type="paragraph" w:styleId="BodyText">
@@ -7000,7 +7041,7 @@
       <w:ind w:left="160" w:right="160"/>
     </w:pPr>
     <w:rPr>
-      <w:rFonts w:ascii="Liberation Mono" w:hAnsi="Liberation Mono" w:eastAsia="Liberation Mono" w:cs="Liberation Mono"/>
+      <w:rFonts w:ascii="Liberation Mono" w:hAnsi="Liberation Mono" w:eastAsia="Noto Sans Mono CJK SC" w:cs="Liberation Mono"/>
       <w:sz w:val="20"/>
       <w:szCs w:val="20"/>
     </w:rPr>
@@ -7031,37 +7072,37 @@
         <a:srgbClr val="000000"/>
       </a:dk1>
       <a:lt1>
-        <a:srgbClr val="ffffff"/>
+        <a:srgbClr val="FFFFFF"/>
       </a:lt1>
       <a:dk2>
         <a:srgbClr val="000000"/>
       </a:dk2>
       <a:lt2>
-        <a:srgbClr val="ffffff"/>
+        <a:srgbClr val="FFFFFF"/>
       </a:lt2>
       <a:accent1>
-        <a:srgbClr val="18a303"/>
+        <a:srgbClr val="18A303"/>
       </a:accent1>
       <a:accent2>
-        <a:srgbClr val="0369a3"/>
+        <a:srgbClr val="0369A3"/>
       </a:accent2>
       <a:accent3>
-        <a:srgbClr val="a33e03"/>
+        <a:srgbClr val="A33E03"/>
       </a:accent3>
       <a:accent4>
-        <a:srgbClr val="8e03a3"/>
+        <a:srgbClr val="8E03A3"/>
       </a:accent4>
       <a:accent5>
-        <a:srgbClr val="c99c00"/>
+        <a:srgbClr val="C99C00"/>
       </a:accent5>
       <a:accent6>
-        <a:srgbClr val="c9211e"/>
+        <a:srgbClr val="C9211E"/>
       </a:accent6>
       <a:hlink>
-        <a:srgbClr val="0000ee"/>
+        <a:srgbClr val="0000EE"/>
       </a:hlink>
       <a:folHlink>
-        <a:srgbClr val="551a8b"/>
+        <a:srgbClr val="551A8B"/>
       </a:folHlink>
     </a:clrScheme>
     <a:fontScheme name="Office">

</xml_diff>

<commit_message>
L-0713: review round 1 fixes
- crew_status: the 0.20 detector is three-valued; an unlistable .crew/ or
  .work/tickets/, or a roles that is not a list, prints could-not-tell
  instead of a migrate prompt; only id-shaped .work/tickets/<ID>.md files
  count as legacy tickets (a README there does not).
- docs: after a migrate the context hook, resume and diagrams read
  crew.json first; guide, README and migrate.md say so.
- plugin-evals.yml: a failed case discovery fails the step instead of
  counting zero and skipping the billed run.
- plugin-evals-runner.py: a claude.cmd stub on Windows.
- README eval roster: the remaining case does not exercise agents/reviewer.md.
</commit_message>
<xml_diff>
--- a/docs/guides/crew/crew-guide.docx
+++ b/docs/guides/crew/crew-guide.docx
@@ -1088,7 +1088,57 @@
       </w:r>
       <w:r>
         <w:rPr/>
-        <w:t xml:space="preserve"> stays, and stays the file crew reads its settings from. Every historical metric it cannot recover is written </w:t>
+        <w:t xml:space="preserve"> stays, and every gate, guard and </w:t>
+      </w:r>
+      <w:r>
+        <w:rPr>
+          <w:rStyle w:val="SourceText"/>
+        </w:rPr>
+        <w:t>/crew:config</w:t>
+      </w:r>
+      <w:r>
+        <w:rPr/>
+        <w:t xml:space="preserve"> keeps reading it; the context hook, resume and the diagram commands read </w:t>
+      </w:r>
+      <w:r>
+        <w:rPr>
+          <w:rStyle w:val="SourceText"/>
+        </w:rPr>
+        <w:t>.crew/crew.json</w:t>
+      </w:r>
+      <w:r>
+        <w:rPr/>
+        <w:t xml:space="preserve"> first when it exists, so after a migrate a </w:t>
+      </w:r>
+      <w:r>
+        <w:rPr>
+          <w:rStyle w:val="SourceText"/>
+        </w:rPr>
+        <w:t>memory</w:t>
+      </w:r>
+      <w:r>
+        <w:rPr/>
+        <w:t xml:space="preserve">, </w:t>
+      </w:r>
+      <w:r>
+        <w:rPr>
+          <w:rStyle w:val="SourceText"/>
+        </w:rPr>
+        <w:t>context</w:t>
+      </w:r>
+      <w:r>
+        <w:rPr/>
+        <w:t xml:space="preserve"> or </w:t>
+      </w:r>
+      <w:r>
+        <w:rPr>
+          <w:rStyle w:val="SourceText"/>
+        </w:rPr>
+        <w:t>docs</w:t>
+      </w:r>
+      <w:r>
+        <w:rPr/>
+        <w:t xml:space="preserve"> setting is changed in both files. Every historical metric it cannot recover is written </w:t>
       </w:r>
       <w:r>
         <w:rPr>

</xml_diff>

<commit_message>
L-0768: promote-gate reads deploy policy from the sha being deployed, not the session's checkout (crew 1.2.22)
From a git worktree both flavours read .crew/verify.json from the project
dir: the review helper ran there and ignored its tree argument, the VERDICT
step and ps1 $cfg read requires/rollback/requireHuman from the same file,
and the uncommitted-map guard judged the project dir. A waiver committed on
the deployed branch was never seen (TSS-win report, crew 1.2.17).

Policy is now the map committed in the deployed sha (git -C <tree> ls-tree
<sha>), with the project dir's map only when the sha carries none. The
github shaInput rule reads the same map. The uncommitted-map guard judges
the map that is policy. Matching and state stay in the project dir.

Owner exception to the 2026-10 crew feature freeze (Matthew, 2026-10-10).
</commit_message>
<xml_diff>
--- a/docs/guides/crew/crew-guide.docx
+++ b/docs/guides/crew/crew-guide.docx
@@ -2946,7 +2946,17 @@
       </w:r>
       <w:r>
         <w:rPr/>
-        <w:t xml:space="preserve"> and a reason), and that the tree is clean. The review evidence proves only that the tracked tree deployed is one a reviewer was shown under a standing receipt: it does not prove that paths the review bundle left out (identical to merged main, or under </w:t>
+        <w:t xml:space="preserve"> and a reason), and that the tree is clean. Those requirements are read from the </w:t>
+      </w:r>
+      <w:r>
+        <w:rPr>
+          <w:rStyle w:val="SourceText"/>
+        </w:rPr>
+        <w:t>.crew/verify.json</w:t>
+      </w:r>
+      <w:r>
+        <w:rPr/>
+        <w:t xml:space="preserve"> committed in the sha being deployed, so a deploy from a worktree follows its own branch's committed map, not the main checkout's. The review evidence proves only that the tracked tree deployed is one a reviewer was shown under a standing receipt: it does not prove that paths the review bundle left out (identical to merged main, or under </w:t>
       </w:r>
       <w:r>
         <w:rPr>

</xml_diff>

<commit_message>
L-0777: document the agents on Kimi (README, CONFIG, PLUGINS, model, providers skill, guide, code map, CHANGELOG)
</commit_message>
<xml_diff>
--- a/docs/guides/crew/crew-guide.docx
+++ b/docs/guides/crew/crew-guide.docx
@@ -142,8 +142,8 @@
       </w:tblPr>
       <w:tblGrid>
         <w:gridCol w:w="1414"/>
-        <w:gridCol w:w="7248"/>
-        <w:gridCol w:w="2677"/>
+        <w:gridCol w:w="5934"/>
+        <w:gridCol w:w="3991"/>
       </w:tblGrid>
       <w:tr>
         <w:trPr>
@@ -173,7 +173,7 @@
         </w:tc>
         <w:tc>
           <w:tcPr>
-            <w:tcW w:w="7248" w:type="dxa"/>
+            <w:tcW w:w="5934" w:type="dxa"/>
             <w:tcBorders/>
             <w:vAlign w:val="center"/>
           </w:tcPr>
@@ -195,7 +195,7 @@
         </w:tc>
         <w:tc>
           <w:tcPr>
-            <w:tcW w:w="2677" w:type="dxa"/>
+            <w:tcW w:w="3991" w:type="dxa"/>
             <w:tcBorders/>
             <w:vAlign w:val="center"/>
           </w:tcPr>
@@ -243,7 +243,7 @@
         </w:tc>
         <w:tc>
           <w:tcPr>
-            <w:tcW w:w="7248" w:type="dxa"/>
+            <w:tcW w:w="5934" w:type="dxa"/>
             <w:tcBorders/>
             <w:vAlign w:val="center"/>
           </w:tcPr>
@@ -264,7 +264,7 @@
         </w:tc>
         <w:tc>
           <w:tcPr>
-            <w:tcW w:w="2677" w:type="dxa"/>
+            <w:tcW w:w="3991" w:type="dxa"/>
             <w:tcBorders/>
             <w:vAlign w:val="center"/>
           </w:tcPr>
@@ -279,7 +279,7 @@
             </w:pPr>
             <w:r>
               <w:rPr/>
-              <w:t>No Write, Edit or Bash</w:t>
+              <w:t>No Write or Edit; Bash only to hand its task to Kimi</w:t>
             </w:r>
           </w:p>
         </w:tc>
@@ -311,7 +311,7 @@
         </w:tc>
         <w:tc>
           <w:tcPr>
-            <w:tcW w:w="7248" w:type="dxa"/>
+            <w:tcW w:w="5934" w:type="dxa"/>
             <w:tcBorders/>
             <w:vAlign w:val="center"/>
           </w:tcPr>
@@ -332,7 +332,7 @@
         </w:tc>
         <w:tc>
           <w:tcPr>
-            <w:tcW w:w="2677" w:type="dxa"/>
+            <w:tcW w:w="3991" w:type="dxa"/>
             <w:tcBorders/>
             <w:vAlign w:val="center"/>
           </w:tcPr>
@@ -379,7 +379,7 @@
         </w:tc>
         <w:tc>
           <w:tcPr>
-            <w:tcW w:w="7248" w:type="dxa"/>
+            <w:tcW w:w="5934" w:type="dxa"/>
             <w:tcBorders/>
             <w:vAlign w:val="center"/>
           </w:tcPr>
@@ -400,7 +400,7 @@
         </w:tc>
         <w:tc>
           <w:tcPr>
-            <w:tcW w:w="2677" w:type="dxa"/>
+            <w:tcW w:w="3991" w:type="dxa"/>
             <w:tcBorders/>
             <w:vAlign w:val="center"/>
           </w:tcPr>
@@ -447,7 +447,7 @@
         </w:tc>
         <w:tc>
           <w:tcPr>
-            <w:tcW w:w="7248" w:type="dxa"/>
+            <w:tcW w:w="5934" w:type="dxa"/>
             <w:tcBorders/>
             <w:vAlign w:val="center"/>
           </w:tcPr>
@@ -468,7 +468,7 @@
         </w:tc>
         <w:tc>
           <w:tcPr>
-            <w:tcW w:w="2677" w:type="dxa"/>
+            <w:tcW w:w="3991" w:type="dxa"/>
             <w:tcBorders/>
             <w:vAlign w:val="center"/>
           </w:tcPr>
@@ -489,6 +489,74 @@
         </w:tc>
       </w:tr>
     </w:tbl>
+    <w:p>
+      <w:pPr>
+        <w:pStyle w:val="BodyText"/>
+        <w:bidi w:val="0"/>
+        <w:jc w:val="left"/>
+        <w:rPr/>
+      </w:pPr>
+      <w:r>
+        <w:rPr>
+          <w:rStyle w:val="Strong"/>
+        </w:rPr>
+        <w:t>Running agents on Kimi.</w:t>
+      </w:r>
+      <w:r>
+        <w:rPr/>
+        <w:t xml:space="preserve"> Claude Code runs subagents on Claude models only, so </w:t>
+      </w:r>
+      <w:r>
+        <w:rPr>
+          <w:rStyle w:val="SourceText"/>
+        </w:rPr>
+        <w:t>explorer</w:t>
+      </w:r>
+      <w:r>
+        <w:rPr/>
+        <w:t xml:space="preserve">, </w:t>
+      </w:r>
+      <w:r>
+        <w:rPr>
+          <w:rStyle w:val="SourceText"/>
+        </w:rPr>
+        <w:t>researcher</w:t>
+      </w:r>
+      <w:r>
+        <w:rPr/>
+        <w:t xml:space="preserve"> and </w:t>
+      </w:r>
+      <w:r>
+        <w:rPr>
+          <w:rStyle w:val="SourceText"/>
+        </w:rPr>
+        <w:t>security</w:t>
+      </w:r>
+      <w:r>
+        <w:rPr/>
+        <w:t xml:space="preserve"> can hand their task to the Kimi Code CLI instead. Pin one with </w:t>
+      </w:r>
+      <w:r>
+        <w:rPr>
+          <w:rStyle w:val="SourceText"/>
+        </w:rPr>
+        <w:t>/crew:model dev.roles.explorer '{"provider": "kimi", "model": "k3"}'</w:t>
+      </w:r>
+      <w:r>
+        <w:rPr/>
+        <w:t xml:space="preserve">. Kimi then answers read-only, and the agent falls back to Claude when Kimi cannot run. Its first line says which one ran. A Kimi </w:t>
+      </w:r>
+      <w:r>
+        <w:rPr>
+          <w:rStyle w:val="SourceText"/>
+        </w:rPr>
+        <w:t>security</w:t>
+      </w:r>
+      <w:r>
+        <w:rPr/>
+        <w:t xml:space="preserve"> review is refused on code Kimi wrote, because the family that wrote a change may not judge it. Nothing is pinned until you pin it.</w:t>
+      </w:r>
+    </w:p>
     <w:p>
       <w:pPr>
         <w:pStyle w:val="BodyText"/>

</xml_diff>

<commit_message>
L-0797: crew 1.2.37: Haiku 5.5 session-relay transport agent (model pin, not a fifth role)
Docs: README, CONFIG.md, crew-context skill, PLUGINS.md, CHANGELOG, guide.md rebuilt (HTML, DOCX, PDF). Code map not re-anchored (L-0764). Install-prerequisites labels say 5 agents. The frontmatter pins the full id claude-haiku-5-5 (owner decision 2026-10-16), probed in a scratch HOME and via a plugin-agent spawn; validate-prompts.py accepts it for session-relay only. Crew feature freeze waived by the owner.
</commit_message>
<xml_diff>
--- a/docs/guides/crew/crew-guide.docx
+++ b/docs/guides/crew/crew-guide.docx
@@ -141,9 +141,9 @@
         </w:tblCellMar>
       </w:tblPr>
       <w:tblGrid>
-        <w:gridCol w:w="1414"/>
-        <w:gridCol w:w="5934"/>
-        <w:gridCol w:w="3991"/>
+        <w:gridCol w:w="1767"/>
+        <w:gridCol w:w="5542"/>
+        <w:gridCol w:w="4030"/>
       </w:tblGrid>
       <w:tr>
         <w:trPr>
@@ -151,7 +151,7 @@
         </w:trPr>
         <w:tc>
           <w:tcPr>
-            <w:tcW w:w="1414" w:type="dxa"/>
+            <w:tcW w:w="1767" w:type="dxa"/>
             <w:tcBorders/>
             <w:vAlign w:val="center"/>
           </w:tcPr>
@@ -173,7 +173,7 @@
         </w:tc>
         <w:tc>
           <w:tcPr>
-            <w:tcW w:w="5934" w:type="dxa"/>
+            <w:tcW w:w="5542" w:type="dxa"/>
             <w:tcBorders/>
             <w:vAlign w:val="center"/>
           </w:tcPr>
@@ -195,7 +195,7 @@
         </w:tc>
         <w:tc>
           <w:tcPr>
-            <w:tcW w:w="3991" w:type="dxa"/>
+            <w:tcW w:w="4030" w:type="dxa"/>
             <w:tcBorders/>
             <w:vAlign w:val="center"/>
           </w:tcPr>
@@ -220,7 +220,75 @@
         <w:trPr/>
         <w:tc>
           <w:tcPr>
-            <w:tcW w:w="1414" w:type="dxa"/>
+            <w:tcW w:w="1767" w:type="dxa"/>
+            <w:tcBorders/>
+            <w:vAlign w:val="center"/>
+          </w:tcPr>
+          <w:p>
+            <w:pPr>
+              <w:pStyle w:val="TableContents"/>
+              <w:shd w:fill="2E3440" w:val="clear"/>
+              <w:bidi w:val="0"/>
+              <w:spacing w:before="120" w:after="120"/>
+              <w:jc w:val="left"/>
+              <w:rPr/>
+            </w:pPr>
+            <w:r>
+              <w:rPr>
+                <w:rStyle w:val="SourceText"/>
+              </w:rPr>
+              <w:t>session-relay</w:t>
+            </w:r>
+          </w:p>
+        </w:tc>
+        <w:tc>
+          <w:tcPr>
+            <w:tcW w:w="5542" w:type="dxa"/>
+            <w:tcBorders/>
+            <w:vAlign w:val="center"/>
+          </w:tcPr>
+          <w:p>
+            <w:pPr>
+              <w:pStyle w:val="TableContents"/>
+              <w:shd w:fill="2E3440" w:val="clear"/>
+              <w:bidi w:val="0"/>
+              <w:spacing w:before="120" w:after="120"/>
+              <w:jc w:val="left"/>
+              <w:rPr/>
+            </w:pPr>
+            <w:r>
+              <w:rPr/>
+              <w:t>Carries messages between sessions on Haiku 5.5; transport only, not a role</w:t>
+            </w:r>
+          </w:p>
+        </w:tc>
+        <w:tc>
+          <w:tcPr>
+            <w:tcW w:w="4030" w:type="dxa"/>
+            <w:tcBorders/>
+            <w:vAlign w:val="center"/>
+          </w:tcPr>
+          <w:p>
+            <w:pPr>
+              <w:pStyle w:val="TableContents"/>
+              <w:shd w:fill="2E3440" w:val="clear"/>
+              <w:bidi w:val="0"/>
+              <w:spacing w:before="120" w:after="120"/>
+              <w:jc w:val="left"/>
+              <w:rPr/>
+            </w:pPr>
+            <w:r>
+              <w:rPr/>
+              <w:t>No Write, Edit or Bash; SendMessage, ListAgents, Read</w:t>
+            </w:r>
+          </w:p>
+        </w:tc>
+      </w:tr>
+      <w:tr>
+        <w:trPr/>
+        <w:tc>
+          <w:tcPr>
+            <w:tcW w:w="1767" w:type="dxa"/>
             <w:tcBorders/>
             <w:vAlign w:val="center"/>
           </w:tcPr>
@@ -243,7 +311,7 @@
         </w:tc>
         <w:tc>
           <w:tcPr>
-            <w:tcW w:w="5934" w:type="dxa"/>
+            <w:tcW w:w="5542" w:type="dxa"/>
             <w:tcBorders/>
             <w:vAlign w:val="center"/>
           </w:tcPr>
@@ -264,7 +332,7 @@
         </w:tc>
         <w:tc>
           <w:tcPr>
-            <w:tcW w:w="3991" w:type="dxa"/>
+            <w:tcW w:w="4030" w:type="dxa"/>
             <w:tcBorders/>
             <w:vAlign w:val="center"/>
           </w:tcPr>
@@ -288,7 +356,7 @@
         <w:trPr/>
         <w:tc>
           <w:tcPr>
-            <w:tcW w:w="1414" w:type="dxa"/>
+            <w:tcW w:w="1767" w:type="dxa"/>
             <w:tcBorders/>
             <w:vAlign w:val="center"/>
           </w:tcPr>
@@ -311,7 +379,7 @@
         </w:tc>
         <w:tc>
           <w:tcPr>
-            <w:tcW w:w="5934" w:type="dxa"/>
+            <w:tcW w:w="5542" w:type="dxa"/>
             <w:tcBorders/>
             <w:vAlign w:val="center"/>
           </w:tcPr>
@@ -332,7 +400,7 @@
         </w:tc>
         <w:tc>
           <w:tcPr>
-            <w:tcW w:w="3991" w:type="dxa"/>
+            <w:tcW w:w="4030" w:type="dxa"/>
             <w:tcBorders/>
             <w:vAlign w:val="center"/>
           </w:tcPr>
@@ -356,7 +424,7 @@
         <w:trPr/>
         <w:tc>
           <w:tcPr>
-            <w:tcW w:w="1414" w:type="dxa"/>
+            <w:tcW w:w="1767" w:type="dxa"/>
             <w:tcBorders/>
             <w:vAlign w:val="center"/>
           </w:tcPr>
@@ -379,7 +447,7 @@
         </w:tc>
         <w:tc>
           <w:tcPr>
-            <w:tcW w:w="5934" w:type="dxa"/>
+            <w:tcW w:w="5542" w:type="dxa"/>
             <w:tcBorders/>
             <w:vAlign w:val="center"/>
           </w:tcPr>
@@ -400,7 +468,7 @@
         </w:tc>
         <w:tc>
           <w:tcPr>
-            <w:tcW w:w="3991" w:type="dxa"/>
+            <w:tcW w:w="4030" w:type="dxa"/>
             <w:tcBorders/>
             <w:vAlign w:val="center"/>
           </w:tcPr>
@@ -424,7 +492,7 @@
         <w:trPr/>
         <w:tc>
           <w:tcPr>
-            <w:tcW w:w="1414" w:type="dxa"/>
+            <w:tcW w:w="1767" w:type="dxa"/>
             <w:tcBorders/>
             <w:vAlign w:val="center"/>
           </w:tcPr>
@@ -447,7 +515,7 @@
         </w:tc>
         <w:tc>
           <w:tcPr>
-            <w:tcW w:w="5934" w:type="dxa"/>
+            <w:tcW w:w="5542" w:type="dxa"/>
             <w:tcBorders/>
             <w:vAlign w:val="center"/>
           </w:tcPr>
@@ -468,7 +536,7 @@
         </w:tc>
         <w:tc>
           <w:tcPr>
-            <w:tcW w:w="3991" w:type="dxa"/>
+            <w:tcW w:w="4030" w:type="dxa"/>
             <w:tcBorders/>
             <w:vAlign w:val="center"/>
           </w:tcPr>

</xml_diff>

<commit_message>
L-0797: FIX round 1: drop redundant FULL_ID_MODELS, specific-line test asserts, relay hub path (subagents hand off to main), 5-agent count in README/guide/code map
Docs: README, guide.md rebuilt (HTML, DOCX, PDF), code map note. Version stays 1.2.37 (unmerged).
</commit_message>
<xml_diff>
--- a/docs/guides/crew/crew-guide.docx
+++ b/docs/guides/crew/crew-guide.docx
@@ -124,7 +124,7 @@
       </w:pPr>
       <w:r>
         <w:rPr/>
-        <w:t>crew 1.1 ships four agents. Each one exists because it buys something a prompt cannot: an isolated context window, a restricted tool set, or independent eyes.</w:t>
+        <w:t>crew 1.1 ships four agents (plus one transport agent, below). Each one exists because it buys something a prompt cannot: an isolated context window, a restricted tool set, or independent eyes.</w:t>
       </w:r>
     </w:p>
     <w:tbl>
@@ -141,9 +141,9 @@
         </w:tblCellMar>
       </w:tblPr>
       <w:tblGrid>
-        <w:gridCol w:w="1767"/>
-        <w:gridCol w:w="5542"/>
-        <w:gridCol w:w="4030"/>
+        <w:gridCol w:w="1414"/>
+        <w:gridCol w:w="5934"/>
+        <w:gridCol w:w="3991"/>
       </w:tblGrid>
       <w:tr>
         <w:trPr>
@@ -151,7 +151,7 @@
         </w:trPr>
         <w:tc>
           <w:tcPr>
-            <w:tcW w:w="1767" w:type="dxa"/>
+            <w:tcW w:w="1414" w:type="dxa"/>
             <w:tcBorders/>
             <w:vAlign w:val="center"/>
           </w:tcPr>
@@ -173,7 +173,7 @@
         </w:tc>
         <w:tc>
           <w:tcPr>
-            <w:tcW w:w="5542" w:type="dxa"/>
+            <w:tcW w:w="5934" w:type="dxa"/>
             <w:tcBorders/>
             <w:vAlign w:val="center"/>
           </w:tcPr>
@@ -195,7 +195,7 @@
         </w:tc>
         <w:tc>
           <w:tcPr>
-            <w:tcW w:w="4030" w:type="dxa"/>
+            <w:tcW w:w="3991" w:type="dxa"/>
             <w:tcBorders/>
             <w:vAlign w:val="center"/>
           </w:tcPr>
@@ -220,75 +220,7 @@
         <w:trPr/>
         <w:tc>
           <w:tcPr>
-            <w:tcW w:w="1767" w:type="dxa"/>
-            <w:tcBorders/>
-            <w:vAlign w:val="center"/>
-          </w:tcPr>
-          <w:p>
-            <w:pPr>
-              <w:pStyle w:val="TableContents"/>
-              <w:shd w:fill="2E3440" w:val="clear"/>
-              <w:bidi w:val="0"/>
-              <w:spacing w:before="120" w:after="120"/>
-              <w:jc w:val="left"/>
-              <w:rPr/>
-            </w:pPr>
-            <w:r>
-              <w:rPr>
-                <w:rStyle w:val="SourceText"/>
-              </w:rPr>
-              <w:t>session-relay</w:t>
-            </w:r>
-          </w:p>
-        </w:tc>
-        <w:tc>
-          <w:tcPr>
-            <w:tcW w:w="5542" w:type="dxa"/>
-            <w:tcBorders/>
-            <w:vAlign w:val="center"/>
-          </w:tcPr>
-          <w:p>
-            <w:pPr>
-              <w:pStyle w:val="TableContents"/>
-              <w:shd w:fill="2E3440" w:val="clear"/>
-              <w:bidi w:val="0"/>
-              <w:spacing w:before="120" w:after="120"/>
-              <w:jc w:val="left"/>
-              <w:rPr/>
-            </w:pPr>
-            <w:r>
-              <w:rPr/>
-              <w:t>Carries messages between sessions on Haiku 5.5; transport only, not a role</w:t>
-            </w:r>
-          </w:p>
-        </w:tc>
-        <w:tc>
-          <w:tcPr>
-            <w:tcW w:w="4030" w:type="dxa"/>
-            <w:tcBorders/>
-            <w:vAlign w:val="center"/>
-          </w:tcPr>
-          <w:p>
-            <w:pPr>
-              <w:pStyle w:val="TableContents"/>
-              <w:shd w:fill="2E3440" w:val="clear"/>
-              <w:bidi w:val="0"/>
-              <w:spacing w:before="120" w:after="120"/>
-              <w:jc w:val="left"/>
-              <w:rPr/>
-            </w:pPr>
-            <w:r>
-              <w:rPr/>
-              <w:t>No Write, Edit or Bash; SendMessage, ListAgents, Read</w:t>
-            </w:r>
-          </w:p>
-        </w:tc>
-      </w:tr>
-      <w:tr>
-        <w:trPr/>
-        <w:tc>
-          <w:tcPr>
-            <w:tcW w:w="1767" w:type="dxa"/>
+            <w:tcW w:w="1414" w:type="dxa"/>
             <w:tcBorders/>
             <w:vAlign w:val="center"/>
           </w:tcPr>
@@ -311,7 +243,7 @@
         </w:tc>
         <w:tc>
           <w:tcPr>
-            <w:tcW w:w="5542" w:type="dxa"/>
+            <w:tcW w:w="5934" w:type="dxa"/>
             <w:tcBorders/>
             <w:vAlign w:val="center"/>
           </w:tcPr>
@@ -332,7 +264,7 @@
         </w:tc>
         <w:tc>
           <w:tcPr>
-            <w:tcW w:w="4030" w:type="dxa"/>
+            <w:tcW w:w="3991" w:type="dxa"/>
             <w:tcBorders/>
             <w:vAlign w:val="center"/>
           </w:tcPr>
@@ -356,7 +288,7 @@
         <w:trPr/>
         <w:tc>
           <w:tcPr>
-            <w:tcW w:w="1767" w:type="dxa"/>
+            <w:tcW w:w="1414" w:type="dxa"/>
             <w:tcBorders/>
             <w:vAlign w:val="center"/>
           </w:tcPr>
@@ -379,7 +311,7 @@
         </w:tc>
         <w:tc>
           <w:tcPr>
-            <w:tcW w:w="5542" w:type="dxa"/>
+            <w:tcW w:w="5934" w:type="dxa"/>
             <w:tcBorders/>
             <w:vAlign w:val="center"/>
           </w:tcPr>
@@ -400,7 +332,7 @@
         </w:tc>
         <w:tc>
           <w:tcPr>
-            <w:tcW w:w="4030" w:type="dxa"/>
+            <w:tcW w:w="3991" w:type="dxa"/>
             <w:tcBorders/>
             <w:vAlign w:val="center"/>
           </w:tcPr>
@@ -424,7 +356,7 @@
         <w:trPr/>
         <w:tc>
           <w:tcPr>
-            <w:tcW w:w="1767" w:type="dxa"/>
+            <w:tcW w:w="1414" w:type="dxa"/>
             <w:tcBorders/>
             <w:vAlign w:val="center"/>
           </w:tcPr>
@@ -447,7 +379,7 @@
         </w:tc>
         <w:tc>
           <w:tcPr>
-            <w:tcW w:w="5542" w:type="dxa"/>
+            <w:tcW w:w="5934" w:type="dxa"/>
             <w:tcBorders/>
             <w:vAlign w:val="center"/>
           </w:tcPr>
@@ -468,7 +400,7 @@
         </w:tc>
         <w:tc>
           <w:tcPr>
-            <w:tcW w:w="4030" w:type="dxa"/>
+            <w:tcW w:w="3991" w:type="dxa"/>
             <w:tcBorders/>
             <w:vAlign w:val="center"/>
           </w:tcPr>
@@ -492,7 +424,7 @@
         <w:trPr/>
         <w:tc>
           <w:tcPr>
-            <w:tcW w:w="1767" w:type="dxa"/>
+            <w:tcW w:w="1414" w:type="dxa"/>
             <w:tcBorders/>
             <w:vAlign w:val="center"/>
           </w:tcPr>
@@ -515,7 +447,7 @@
         </w:tc>
         <w:tc>
           <w:tcPr>
-            <w:tcW w:w="5542" w:type="dxa"/>
+            <w:tcW w:w="5934" w:type="dxa"/>
             <w:tcBorders/>
             <w:vAlign w:val="center"/>
           </w:tcPr>
@@ -536,7 +468,7 @@
         </w:tc>
         <w:tc>
           <w:tcPr>
-            <w:tcW w:w="4030" w:type="dxa"/>
+            <w:tcW w:w="3991" w:type="dxa"/>
             <w:tcBorders/>
             <w:vAlign w:val="center"/>
           </w:tcPr>
@@ -557,6 +489,28 @@
         </w:tc>
       </w:tr>
     </w:tbl>
+    <w:p>
+      <w:pPr>
+        <w:pStyle w:val="BodyText"/>
+        <w:bidi w:val="0"/>
+        <w:jc w:val="left"/>
+        <w:rPr/>
+      </w:pPr>
+      <w:r>
+        <w:rPr/>
+        <w:t xml:space="preserve">A fifth file, </w:t>
+      </w:r>
+      <w:r>
+        <w:rPr>
+          <w:rStyle w:val="SourceText"/>
+        </w:rPr>
+        <w:t>session-relay</w:t>
+      </w:r>
+      <w:r>
+        <w:rPr/>
+        <w:t>, is not a role: it is a transport agent on Haiku 5.5 that carries messages between sessions (SendMessage, ListAgents, Read; no Write, Edit or Bash).</w:t>
+      </w:r>
+    </w:p>
     <w:p>
       <w:pPr>
         <w:pStyle w:val="BodyText"/>

</xml_diff>

<commit_message>
L-0799: crew 1.2.38: coordinator as a model pin on an existing role; wave lanes carry the developer model
Crew feature freeze waived by the owner for this ticket (2026-10-16).
Docs: CONFIG.md, crew README, autopilot.md, model.md, guide, codemap, rules, CHANGELOG.
</commit_message>
<xml_diff>
--- a/docs/guides/crew/crew-guide.docx
+++ b/docs/guides/crew/crew-guide.docx
@@ -509,6 +509,74 @@
       <w:r>
         <w:rPr/>
         <w:t>, is not a role: it is a transport agent on Haiku 5.5 that carries messages between sessions (SendMessage and ListAgents only; no Read, Write, Edit or Bash).</w:t>
+      </w:r>
+    </w:p>
+    <w:p>
+      <w:pPr>
+        <w:pStyle w:val="BodyText"/>
+        <w:bidi w:val="0"/>
+        <w:jc w:val="left"/>
+        <w:rPr/>
+      </w:pPr>
+      <w:r>
+        <w:rPr>
+          <w:rStyle w:val="Strong"/>
+        </w:rPr>
+        <w:t>The coordinator is a model pin, not a role.</w:t>
+      </w:r>
+      <w:r>
+        <w:rPr/>
+        <w:t xml:space="preserve"> Set </w:t>
+      </w:r>
+      <w:r>
+        <w:rPr>
+          <w:rStyle w:val="SourceText"/>
+        </w:rPr>
+        <w:t>dev.roles.coordinator</w:t>
+      </w:r>
+      <w:r>
+        <w:rPr/>
+        <w:t xml:space="preserve"> (for example </w:t>
+      </w:r>
+      <w:r>
+        <w:rPr>
+          <w:rStyle w:val="SourceText"/>
+        </w:rPr>
+        <w:t>{"provider": "claude", "model": "claude-opus-5-5"}</w:t>
+      </w:r>
+      <w:r>
+        <w:rPr/>
+        <w:t xml:space="preserve">) and </w:t>
+      </w:r>
+      <w:r>
+        <w:rPr>
+          <w:rStyle w:val="SourceText"/>
+        </w:rPr>
+        <w:t>dev.roles.developer</w:t>
+      </w:r>
+      <w:r>
+        <w:rPr/>
+        <w:t xml:space="preserve"> (for example </w:t>
+      </w:r>
+      <w:r>
+        <w:rPr>
+          <w:rStyle w:val="SourceText"/>
+        </w:rPr>
+        <w:t>{"provider": "claude", "model": "claude-sonnet-5-5"}</w:t>
+      </w:r>
+      <w:r>
+        <w:rPr/>
+        <w:t xml:space="preserve">) in </w:t>
+      </w:r>
+      <w:r>
+        <w:rPr>
+          <w:rStyle w:val="SourceText"/>
+        </w:rPr>
+        <w:t>/crew:model</w:t>
+      </w:r>
+      <w:r>
+        <w:rPr/>
+        <w:t>. A wave prints the coordinator pin and puts the developer model on every lane launch. Both default to unset, which changes nothing.</w:t>
       </w:r>
     </w:p>
     <w:p>

</xml_diff>

<commit_message>
L-0726 slice 2: cut the instruction surface (README to an entry point, promote.md, verify.json rationale, byte and README ceilings)
</commit_message>
<xml_diff>
--- a/docs/guides/crew/crew-guide.docx
+++ b/docs/guides/crew/crew-guide.docx
@@ -4154,11 +4154,11 @@
         <w:rPr>
           <w:rStyle w:val="SourceText"/>
         </w:rPr>
-        <w:t>plugin/crew/README.md</w:t>
-      </w:r>
-      <w:r>
-        <w:rPr/>
-        <w:t>, section 10.</w:t>
+        <w:t>docs/crew/reference/10-the-daily-loop.md</w:t>
+      </w:r>
+      <w:r>
+        <w:rPr/>
+        <w:t xml:space="preserve"> (moved out of the crew README's section 10).</w:t>
       </w:r>
     </w:p>
     <w:p>
@@ -5040,11 +5040,11 @@
         <w:rPr>
           <w:rStyle w:val="SourceText"/>
         </w:rPr>
-        <w:t>plugin/crew/README.md</w:t>
-      </w:r>
-      <w:r>
-        <w:rPr/>
-        <w:t>, section 25). Ticket T-0506 tracks the cause.</w:t>
+        <w:t>docs/crew/reference/25-command-and-agent-reference.md</w:t>
+      </w:r>
+      <w:r>
+        <w:rPr/>
+        <w:t>, moved out of the crew README's section 25). Ticket T-0506 tracks the cause.</w:t>
       </w:r>
     </w:p>
     <w:p>

</xml_diff>

<commit_message>
L-0871: cloud guard no longer refuses python/node code that names nothing (feature, no version bump yet)
Docs: CONFIG.md, configuration reference, guide, troubleshooting (rebuilt), codemap note.
</commit_message>
<xml_diff>
--- a/docs/guides/crew/crew-guide.docx
+++ b/docs/guides/crew/crew-guide.docx
@@ -3076,7 +3076,17 @@
       </w:r>
       <w:r>
         <w:rPr/>
-        <w:t xml:space="preserve"> a command hidden in an interpreter (a Python script that calls the cloud SDK), a variable or an encoded string. The credentials boundary that would close that is T-0044.</w:t>
+        <w:t xml:space="preserve"> a command hidden in an interpreter (a Python script that calls the cloud SDK, or code that reads the command from an environment variable), a variable or an encoded string. For </w:t>
+      </w:r>
+      <w:r>
+        <w:rPr>
+          <w:rStyle w:val="SourceText"/>
+        </w:rPr>
+        <w:t>terraform apply</w:t>
+      </w:r>
+      <w:r>
+        <w:rPr/>
+        <w:t xml:space="preserve"> an interpreter line is refused only when the code or the line names the tool or builds its name. The credentials boundary that would close that is T-0044.</w:t>
       </w:r>
     </w:p>
     <w:p>

</xml_diff>

<commit_message>
L-0725: docs sweep, rebuilt guides and diagrams, test fixes, migrate.md within budget
</commit_message>
<xml_diff>
--- a/docs/guides/crew/crew-guide.docx
+++ b/docs/guides/crew/crew-guide.docx
@@ -2671,37 +2671,27 @@
       </w:r>
       <w:r>
         <w:rPr/>
-        <w:t xml:space="preserve"> set it), the cloud guard's hook (</w:t>
-      </w:r>
-      <w:r>
-        <w:rPr>
-          <w:rStyle w:val="SourceText"/>
-        </w:rPr>
-        <w:t>guards.cloudGuard: off</w:t>
-      </w:r>
-      <w:r>
-        <w:rPr/>
-        <w:t>), the environment guard (</w:t>
-      </w:r>
-      <w:r>
-        <w:rPr>
-          <w:rStyle w:val="SourceText"/>
-        </w:rPr>
-        <w:t>guards.envGuard: off</w:t>
-      </w:r>
-      <w:r>
-        <w:rPr/>
-        <w:t>) and the role-write guard (</w:t>
-      </w:r>
-      <w:r>
-        <w:rPr>
-          <w:rStyle w:val="SourceText"/>
-        </w:rPr>
-        <w:t>guards.roleWrites: off</w:t>
-      </w:r>
-      <w:r>
-        <w:rPr/>
-        <w:t xml:space="preserve">). </w:t>
+        <w:t xml:space="preserve"> set it), the cloud guard's hook, the environment guard and the role-write guard. All three are </w:t>
+      </w:r>
+      <w:r>
+        <w:rPr>
+          <w:rStyle w:val="SourceText"/>
+        </w:rPr>
+        <w:t>off</w:t>
+      </w:r>
+      <w:r>
+        <w:rPr/>
+        <w:t xml:space="preserve"> under the default </w:t>
+      </w:r>
+      <w:r>
+        <w:rPr>
+          <w:rStyle w:val="SourceText"/>
+        </w:rPr>
+        <w:t>guards.profile</w:t>
+      </w:r>
+      <w:r>
+        <w:rPr/>
+        <w:t xml:space="preserve">. </w:t>
       </w:r>
     </w:p>
     <w:p>
@@ -2716,7 +2706,6 @@
           <w:tab w:val="left" w:pos="829" w:leader="none"/>
         </w:tabs>
         <w:bidi w:val="0"/>
-        <w:spacing w:before="120" w:after="0"/>
         <w:ind w:hanging="283" w:left="829"/>
         <w:jc w:val="left"/>
         <w:rPr/>
@@ -2741,7 +2730,7 @@
         <w:rPr>
           <w:rStyle w:val="SourceText"/>
         </w:rPr>
-        <w:t>guards.terraformApply</w:t>
+        <w:t>terraformApply</w:t>
       </w:r>
       <w:r>
         <w:rPr/>
@@ -2825,7 +2814,149 @@
       </w:r>
       <w:r>
         <w:rPr/>
-        <w:t xml:space="preserve">). The policy guards take effect only once </w:t>
+        <w:t xml:space="preserve">). The policy guards take effect only once the cloud guard is armed, except </w:t>
+      </w:r>
+      <w:r>
+        <w:rPr>
+          <w:rStyle w:val="SourceText"/>
+        </w:rPr>
+        <w:t>mergeGate</w:t>
+      </w:r>
+      <w:r>
+        <w:rPr/>
+        <w:t xml:space="preserve">, which </w:t>
+      </w:r>
+      <w:r>
+        <w:rPr>
+          <w:rStyle w:val="SourceText"/>
+        </w:rPr>
+        <w:t>/crew:gate</w:t>
+      </w:r>
+      <w:r>
+        <w:rPr/>
+        <w:t xml:space="preserve"> reads. </w:t>
+      </w:r>
+    </w:p>
+    <w:p>
+      <w:pPr>
+        <w:pStyle w:val="BodyText"/>
+        <w:bidi w:val="0"/>
+        <w:jc w:val="left"/>
+        <w:rPr/>
+      </w:pPr>
+      <w:r>
+        <w:rPr/>
+        <w:t xml:space="preserve">You choose a posture with one setting, </w:t>
+      </w:r>
+      <w:r>
+        <w:rPr>
+          <w:rStyle w:val="SourceText"/>
+        </w:rPr>
+        <w:t>guards.profile</w:t>
+      </w:r>
+      <w:r>
+        <w:rPr/>
+        <w:t xml:space="preserve">: </w:t>
+      </w:r>
+      <w:r>
+        <w:rPr>
+          <w:rStyle w:val="SourceText"/>
+        </w:rPr>
+        <w:t>off</w:t>
+      </w:r>
+      <w:r>
+        <w:rPr/>
+        <w:t xml:space="preserve"> (the default), </w:t>
+      </w:r>
+      <w:r>
+        <w:rPr>
+          <w:rStyle w:val="SourceText"/>
+        </w:rPr>
+        <w:t>standard</w:t>
+      </w:r>
+      <w:r>
+        <w:rPr/>
+        <w:t xml:space="preserve"> (cloud guard </w:t>
+      </w:r>
+      <w:r>
+        <w:rPr>
+          <w:rStyle w:val="SourceText"/>
+        </w:rPr>
+        <w:t>block</w:t>
+      </w:r>
+      <w:r>
+        <w:rPr/>
+        <w:t xml:space="preserve">, role-write guard </w:t>
+      </w:r>
+      <w:r>
+        <w:rPr>
+          <w:rStyle w:val="SourceText"/>
+        </w:rPr>
+        <w:t>report</w:t>
+      </w:r>
+      <w:r>
+        <w:rPr/>
+        <w:t xml:space="preserve">, </w:t>
+      </w:r>
+      <w:r>
+        <w:rPr>
+          <w:rStyle w:val="SourceText"/>
+        </w:rPr>
+        <w:t>adminMerge</w:t>
+      </w:r>
+      <w:r>
+        <w:rPr/>
+        <w:t xml:space="preserve"> </w:t>
+      </w:r>
+      <w:r>
+        <w:rPr>
+          <w:rStyle w:val="SourceText"/>
+        </w:rPr>
+        <w:t>ask</w:t>
+      </w:r>
+      <w:r>
+        <w:rPr/>
+        <w:t xml:space="preserve">) or </w:t>
+      </w:r>
+      <w:r>
+        <w:rPr>
+          <w:rStyle w:val="SourceText"/>
+        </w:rPr>
+        <w:t>strict</w:t>
+      </w:r>
+      <w:r>
+        <w:rPr/>
+        <w:t xml:space="preserve"> (the cloud, environment and role-write guards all </w:t>
+      </w:r>
+      <w:r>
+        <w:rPr>
+          <w:rStyle w:val="SourceText"/>
+        </w:rPr>
+        <w:t>block</w:t>
+      </w:r>
+      <w:r>
+        <w:rPr/>
+        <w:t xml:space="preserve">). To move one guard away from the profile, set </w:t>
+      </w:r>
+      <w:r>
+        <w:rPr>
+          <w:rStyle w:val="SourceText"/>
+        </w:rPr>
+        <w:t>guards.overrides.&lt;guard&gt;</w:t>
+      </w:r>
+      <w:r>
+        <w:rPr/>
+        <w:t xml:space="preserve">, for example </w:t>
+      </w:r>
+      <w:r>
+        <w:rPr>
+          <w:rStyle w:val="SourceText"/>
+        </w:rPr>
+        <w:t>guards.overrides.roleWrites: report</w:t>
+      </w:r>
+      <w:r>
+        <w:rPr/>
+        <w:t>. The twelve per-guard keys (</w:t>
       </w:r>
       <w:r>
         <w:rPr>
@@ -2835,45 +2966,18 @@
       </w:r>
       <w:r>
         <w:rPr/>
-        <w:t xml:space="preserve"> is armed, except </w:t>
-      </w:r>
-      <w:r>
-        <w:rPr>
-          <w:rStyle w:val="SourceText"/>
-        </w:rPr>
-        <w:t>mergeGate</w:t>
-      </w:r>
-      <w:r>
-        <w:rPr/>
-        <w:t xml:space="preserve">, which </w:t>
-      </w:r>
-      <w:r>
-        <w:rPr>
-          <w:rStyle w:val="SourceText"/>
-        </w:rPr>
-        <w:t>/crew:gate</w:t>
-      </w:r>
-      <w:r>
-        <w:rPr/>
-        <w:t xml:space="preserve"> reads. </w:t>
-      </w:r>
-    </w:p>
-    <w:p>
-      <w:pPr>
-        <w:pStyle w:val="BodyText"/>
-        <w:numPr>
-          <w:ilvl w:val="0"/>
-          <w:numId w:val="4"/>
-        </w:numPr>
-        <w:tabs>
-          <w:tab w:val="clear" w:pos="1134"/>
-          <w:tab w:val="left" w:pos="829" w:leader="none"/>
-        </w:tabs>
-        <w:bidi w:val="0"/>
-        <w:ind w:hanging="283" w:left="829"/>
-        <w:jc w:val="left"/>
-        <w:rPr/>
-      </w:pPr>
+        <w:t xml:space="preserve"> and the rest) are no longer written; an old one still counts until </w:t>
+      </w:r>
+      <w:r>
+        <w:rPr>
+          <w:rStyle w:val="SourceText"/>
+        </w:rPr>
+        <w:t>/crew:migrate</w:t>
+      </w:r>
+      <w:r>
+        <w:rPr/>
+        <w:t xml:space="preserve"> rewrites the layer. Each layer expands its own profile and overrides, and the narrower layer wins per guard. - </w:t>
+      </w:r>
       <w:r>
         <w:rPr>
           <w:rStyle w:val="Strong"/>
@@ -2892,7 +2996,7 @@
       </w:r>
       <w:r>
         <w:rPr/>
-        <w:t xml:space="preserve">) blocks when a verify rule fails. </w:t>
+        <w:t>) blocks when a verify rule fails.</w:t>
       </w:r>
     </w:p>
     <w:p>
@@ -3012,11 +3116,31 @@
         <w:rPr>
           <w:rStyle w:val="SourceText"/>
         </w:rPr>
-        <w:t>guards.cloudGuard</w:t>
-      </w:r>
-      <w:r>
-        <w:rPr/>
-        <w:t xml:space="preserve">, default </w:t>
+        <w:t>guards.profile</w:t>
+      </w:r>
+      <w:r>
+        <w:rPr/>
+        <w:t xml:space="preserve"> </w:t>
+      </w:r>
+      <w:r>
+        <w:rPr>
+          <w:rStyle w:val="SourceText"/>
+        </w:rPr>
+        <w:t>standard</w:t>
+      </w:r>
+      <w:r>
+        <w:rPr/>
+        <w:t xml:space="preserve">, or </w:t>
+      </w:r>
+      <w:r>
+        <w:rPr>
+          <w:rStyle w:val="SourceText"/>
+        </w:rPr>
+        <w:t>guards.overrides.cloudGuard</w:t>
+      </w:r>
+      <w:r>
+        <w:rPr/>
+        <w:t xml:space="preserve">; default </w:t>
       </w:r>
       <w:r>
         <w:rPr>
@@ -3036,17 +3160,17 @@
       </w:r>
       <w:r>
         <w:rPr/>
-        <w:t xml:space="preserve">, a force push, an admin merge, destructive cloud CLI calls, destructive SQL, and anything aimed at a declared production database or host. Each rule has its own </w:t>
-      </w:r>
-      <w:r>
-        <w:rPr>
-          <w:rStyle w:val="SourceText"/>
-        </w:rPr>
-        <w:t>guards.*</w:t>
-      </w:r>
-      <w:r>
-        <w:rPr/>
-        <w:t xml:space="preserve"> setting. Set </w:t>
+        <w:t xml:space="preserve">, a force push, an admin merge, destructive cloud CLI calls, destructive SQL, and anything aimed at a declared production database or host. Each rule has its own entry under </w:t>
+      </w:r>
+      <w:r>
+        <w:rPr>
+          <w:rStyle w:val="SourceText"/>
+        </w:rPr>
+        <w:t>guards.overrides</w:t>
+      </w:r>
+      <w:r>
+        <w:rPr/>
+        <w:t xml:space="preserve">. Set </w:t>
       </w:r>
       <w:r>
         <w:rPr>
@@ -3100,11 +3224,31 @@
         <w:rPr>
           <w:rStyle w:val="SourceText"/>
         </w:rPr>
-        <w:t>guards.envGuard</w:t>
-      </w:r>
-      <w:r>
-        <w:rPr/>
-        <w:t xml:space="preserve">, default </w:t>
+        <w:t>guards.overrides.envGuard</w:t>
+      </w:r>
+      <w:r>
+        <w:rPr/>
+        <w:t xml:space="preserve">, or </w:t>
+      </w:r>
+      <w:r>
+        <w:rPr>
+          <w:rStyle w:val="SourceText"/>
+        </w:rPr>
+        <w:t>guards.profile</w:t>
+      </w:r>
+      <w:r>
+        <w:rPr/>
+        <w:t xml:space="preserve"> </w:t>
+      </w:r>
+      <w:r>
+        <w:rPr>
+          <w:rStyle w:val="SourceText"/>
+        </w:rPr>
+        <w:t>strict</w:t>
+      </w:r>
+      <w:r>
+        <w:rPr/>
+        <w:t xml:space="preserve">; default </w:t>
       </w:r>
       <w:r>
         <w:rPr>
@@ -3718,27 +3862,7 @@
       </w:r>
       <w:r>
         <w:rPr/>
-        <w:t xml:space="preserve">, the default, it also merges once every required check passes, or fails under a name listed exactly in </w:t>
-      </w:r>
-      <w:r>
-        <w:rPr>
-          <w:rStyle w:val="SourceText"/>
-        </w:rPr>
-        <w:t>autopilot.knownFailures</w:t>
-      </w:r>
-      <w:r>
-        <w:rPr/>
-        <w:t xml:space="preserve">, waiting up to </w:t>
-      </w:r>
-      <w:r>
-        <w:rPr>
-          <w:rStyle w:val="SourceText"/>
-        </w:rPr>
-        <w:t>autopilot.ciTimeoutMinutes</w:t>
-      </w:r>
-      <w:r>
-        <w:rPr/>
-        <w:t xml:space="preserve">. It always merges with a merge commit, never a squash, a rebase or </w:t>
+        <w:t xml:space="preserve">, the default, it also merges once every required check passes, waiting up to 60 minutes for CI (fixed). A failing check is never waved through by name: the known-failures list is empty and no setting fills it. It always merges with a merge commit, never a squash, a rebase or </w:t>
       </w:r>
       <w:r>
         <w:rPr>
@@ -4482,57 +4606,7 @@
       </w:pPr>
       <w:r>
         <w:rPr/>
-        <w:t xml:space="preserve">Long jobs follow </w:t>
-      </w:r>
-      <w:r>
-        <w:rPr>
-          <w:rStyle w:val="SourceText"/>
-        </w:rPr>
-        <w:t>shellRoute.mode</w:t>
-      </w:r>
-      <w:r>
-        <w:rPr/>
-        <w:t xml:space="preserve"> (</w:t>
-      </w:r>
-      <w:r>
-        <w:rPr>
-          <w:rStyle w:val="SourceText"/>
-        </w:rPr>
-        <w:t>auto</w:t>
-      </w:r>
-      <w:r>
-        <w:rPr/>
-        <w:t xml:space="preserve">, </w:t>
-      </w:r>
-      <w:r>
-        <w:rPr>
-          <w:rStyle w:val="SourceText"/>
-        </w:rPr>
-        <w:t>wsl</w:t>
-      </w:r>
-      <w:r>
-        <w:rPr/>
-        <w:t xml:space="preserve">, </w:t>
-      </w:r>
-      <w:r>
-        <w:rPr>
-          <w:rStyle w:val="SourceText"/>
-        </w:rPr>
-        <w:t>powershell</w:t>
-      </w:r>
-      <w:r>
-        <w:rPr/>
-        <w:t xml:space="preserve"> or </w:t>
-      </w:r>
-      <w:r>
-        <w:rPr>
-          <w:rStyle w:val="SourceText"/>
-        </w:rPr>
-        <w:t>gitbash</w:t>
-      </w:r>
-      <w:r>
-        <w:rPr/>
-        <w:t xml:space="preserve">). </w:t>
+        <w:t xml:space="preserve">Long jobs take an automatically chosen shell route. </w:t>
       </w:r>
       <w:r>
         <w:rPr>
@@ -5864,7 +5938,17 @@
       </w:r>
       <w:r>
         <w:rPr/>
-        <w:t xml:space="preserve"> holds the reasoning behind each setting, and ships with the plugin. </w:t>
+        <w:t xml:space="preserve"> is the generated settings table and ships with the plugin. The reasoning behind each setting is in </w:t>
+      </w:r>
+      <w:r>
+        <w:rPr>
+          <w:rStyle w:val="SourceText"/>
+        </w:rPr>
+        <w:t>docs/crew/config-rationale.md</w:t>
+      </w:r>
+      <w:r>
+        <w:rPr/>
+        <w:t xml:space="preserve"> in the repository. </w:t>
       </w:r>
     </w:p>
     <w:p>

</xml_diff>